<commit_message>
update cv - wkhtmltopdf depracated so need to reformat cv to look better
</commit_message>
<xml_diff>
--- a/content/cv/Nicholas_Giangreco_CV.docx
+++ b/content/cv/Nicholas_Giangreco_CV.docx
@@ -7,16 +7,10 @@
         <w:pStyle w:val="Title"/>
       </w:pPr>
       <w:r>
-        <w:t xml:space="preserve">Nick</w:t>
-      </w:r>
-      <w:r>
-        <w:t xml:space="preserve"> </w:t>
-      </w:r>
-      <w:r>
-        <w:t xml:space="preserve">Giangreco</w:t>
-      </w:r>
-    </w:p>
-    <w:bookmarkStart w:id="25" w:name="Xe558183083914ac790298cd2dda754f1d017843"/>
+        <w:t xml:space="preserve">Nick Giangreco</w:t>
+      </w:r>
+    </w:p>
+    <w:bookmarkStart w:id="14" w:name="Xe558183083914ac790298cd2dda754f1d017843"/>
     <w:p>
       <w:pPr>
         <w:pStyle w:val="Heading3"/>
@@ -24,6 +18,7 @@
       <w:r>
         <w:rPr>
           <w:i/>
+          <w:iCs/>
         </w:rPr>
         <w:t xml:space="preserve">Independent and collaborative precision medicine scientist and engineer</w:t>
       </w:r>
@@ -32,7 +27,7 @@
       <w:pPr>
         <w:pStyle w:val="FirstParagraph"/>
       </w:pPr>
-      <w:hyperlink r:id="rId20">
+      <w:hyperlink r:id="rId9">
         <w:r>
           <w:rPr>
             <w:rStyle w:val="Hyperlink"/>
@@ -49,7 +44,7 @@
       <w:r>
         <w:t xml:space="preserve"> </w:t>
       </w:r>
-      <w:hyperlink r:id="rId21">
+      <w:hyperlink r:id="rId10">
         <w:r>
           <w:rPr>
             <w:rStyle w:val="Hyperlink"/>
@@ -66,7 +61,7 @@
       <w:r>
         <w:t xml:space="preserve"> </w:t>
       </w:r>
-      <w:hyperlink r:id="rId22">
+      <w:hyperlink r:id="rId11">
         <w:r>
           <w:rPr>
             <w:rStyle w:val="Hyperlink"/>
@@ -83,7 +78,7 @@
       <w:r>
         <w:t xml:space="preserve"> </w:t>
       </w:r>
-      <w:hyperlink r:id="rId23">
+      <w:hyperlink r:id="rId12">
         <w:r>
           <w:rPr>
             <w:rStyle w:val="Hyperlink"/>
@@ -100,7 +95,7 @@
       <w:r>
         <w:t xml:space="preserve"> </w:t>
       </w:r>
-      <w:hyperlink r:id="rId24">
+      <w:hyperlink r:id="rId13">
         <w:r>
           <w:rPr>
             <w:rStyle w:val="Hyperlink"/>
@@ -120,6 +115,7 @@
       <w:r>
         <w:rPr>
           <w:b/>
+          <w:bCs/>
         </w:rPr>
         <w:t xml:space="preserve">Date of preparation:</w:t>
       </w:r>
@@ -127,20 +123,22 @@
         <w:t xml:space="preserve"> </w:t>
       </w:r>
       <w:r>
-        <w:t xml:space="preserve">December 29th 2025</w:t>
+        <w:t xml:space="preserve">May 3rd, 2026</w:t>
       </w:r>
     </w:p>
     <w:tbl>
       <w:tblPr>
         <w:tblStyle w:val="Table"/>
-        <w:tblW w:type="pct" w:w="5000.0"/>
-        <w:tblLook w:firstRow="0" w:lastRow="0" w:firstColumn="0" w:lastColumn="0" w:noHBand="0" w:noVBand="0"/>
+        <w:tblW w:type="pct" w:w="5000"/>
+        <w:tblLayout w:type="fixed"/>
+        <w:tblLook w:firstRow="0" w:lastRow="0" w:firstColumn="0" w:lastColumn="0" w:noHBand="0" w:noVBand="0" w:val="0000"/>
       </w:tblPr>
       <w:tblGrid>
         <w:gridCol w:w="7920"/>
       </w:tblGrid>
       <w:tr>
         <w:tc>
+          <w:tcPr/>
           <w:p>
             <w:pPr>
               <w:pStyle w:val="Compact"/>
@@ -149,6 +147,7 @@
             <w:r>
               <w:rPr>
                 <w:b/>
+                <w:bCs/>
               </w:rPr>
               <w:t xml:space="preserve">Topic expertise:</w:t>
             </w:r>
@@ -156,13 +155,14 @@
               <w:t xml:space="preserve"> </w:t>
             </w:r>
             <w:r>
-              <w:t xml:space="preserve">Pediatric drug safety, Genetics, Biomarker discovery, Systems Biology, Statistics, Cancer Biology, Reproducible Research</w:t>
+              <w:t xml:space="preserve">Pediatric drug safety, Genetics, Biomarker discovery, Systems biology, Statistics, Cancer biology, Reproducible research, Project management</w:t>
             </w:r>
           </w:p>
         </w:tc>
       </w:tr>
       <w:tr>
         <w:tc>
+          <w:tcPr/>
           <w:p>
             <w:pPr>
               <w:pStyle w:val="Compact"/>
@@ -171,6 +171,7 @@
             <w:r>
               <w:rPr>
                 <w:b/>
+                <w:bCs/>
               </w:rPr>
               <w:t xml:space="preserve">Technical expertise:</w:t>
             </w:r>
@@ -178,13 +179,14 @@
               <w:t xml:space="preserve"> </w:t>
             </w:r>
             <w:r>
-              <w:t xml:space="preserve">Biomedical data science, (R/Python) software development, {plumber} APIs, machine learning, statistical simulation, data cleaning, data pipelines, Shiny (for R and Python) application development, object oriented programming, RMarkdown/JuPyteR/Quarto, Claude Code and LLM API usage, Microsoft Power App and API user</w:t>
+              <w:t xml:space="preserve">Biomedical data science, (R/Python) software development, {plumber} APIs, Machine learning, Statistical simulation, Data cleaning, Data pipelines, Shiny (for R and Python) application development, Object oriented programming, RMarkdown/JuPyteR/Quarto, Claude Code and LLM API usage, Microsoft Graph API</w:t>
             </w:r>
           </w:p>
         </w:tc>
       </w:tr>
       <w:tr>
         <w:tc>
+          <w:tcPr/>
           <w:p>
             <w:pPr>
               <w:pStyle w:val="Compact"/>
@@ -193,6 +195,7 @@
             <w:r>
               <w:rPr>
                 <w:b/>
+                <w:bCs/>
               </w:rPr>
               <w:t xml:space="preserve">Programming Languages:</w:t>
             </w:r>
@@ -200,14 +203,14 @@
               <w:t xml:space="preserve"> </w:t>
             </w:r>
             <w:r>
-              <w:t xml:space="preserve">R, Python, SQL, HTML, CSS, Observable Javascript, Java, Bash</w:t>
+              <w:t xml:space="preserve">R, Python, SQL, HTML, CSS, Observable Javascript, React, Java, Bash</w:t>
             </w:r>
           </w:p>
         </w:tc>
       </w:tr>
     </w:tbl>
-    <w:bookmarkEnd w:id="25"/>
-    <w:bookmarkStart w:id="39" w:name="work-experience"/>
+    <w:bookmarkEnd w:id="14"/>
+    <w:bookmarkStart w:id="28" w:name="work-experience"/>
     <w:p>
       <w:pPr>
         <w:pStyle w:val="Heading2"/>
@@ -231,13 +234,14 @@
       <w:r>
         <w:rPr>
           <w:b/>
+          <w:bCs/>
         </w:rPr>
         <w:t xml:space="preserve">Computer Sciences Advisor (Remote)</w:t>
       </w:r>
       <w:r>
         <w:t xml:space="preserve"> </w:t>
       </w:r>
-      <w:hyperlink r:id="rId26">
+      <w:hyperlink r:id="rId15">
         <w:r>
           <w:rPr>
             <w:rStyle w:val="Hyperlink"/>
@@ -272,13 +276,14 @@
       <w:r>
         <w:rPr>
           <w:b/>
+          <w:bCs/>
         </w:rPr>
-        <w:t xml:space="preserve">Senior Scientist, Quantitative Biomarker Science (Remote)</w:t>
-      </w:r>
-      <w:r>
-        <w:t xml:space="preserve"> </w:t>
-      </w:r>
-      <w:hyperlink r:id="rId27">
+        <w:t xml:space="preserve">Principal Computational Scientist, Quantitative Biomarker Science (Remote)</w:t>
+      </w:r>
+      <w:r>
+        <w:t xml:space="preserve"> </w:t>
+      </w:r>
+      <w:hyperlink r:id="rId16">
         <w:r>
           <w:rPr>
             <w:rStyle w:val="Hyperlink"/>
@@ -295,40 +300,40 @@
         <w:pStyle w:val="Definition"/>
       </w:pPr>
       <w:r>
-        <w:t xml:space="preserve">Precision Medicine - scientist, data architect, software developer, and applications engineer</w:t>
-      </w:r>
-    </w:p>
-    <w:p>
-      <w:pPr>
+        <w:t xml:space="preserve">Associate -&gt; Senior -&gt; Principal Computational Scientist</w:t>
+      </w:r>
+    </w:p>
+    <w:p>
+      <w:pPr>
+        <w:pStyle w:val="Compact"/>
         <w:numPr>
           <w:ilvl w:val="0"/>
           <w:numId w:val="1001"/>
         </w:numPr>
-        <w:pStyle w:val="Compact"/>
-      </w:pPr>
-      <w:r>
-        <w:t xml:space="preserve">Deliver decision-ready analyses supporting rare disease programs and clinical drug development.</w:t>
-      </w:r>
-    </w:p>
-    <w:p>
-      <w:pPr>
+      </w:pPr>
+      <w:r>
+        <w:t xml:space="preserve">Deliver decision-ready analyses supporting rare disease programs and pre-clinical and clinical drug development.</w:t>
+      </w:r>
+    </w:p>
+    <w:p>
+      <w:pPr>
+        <w:pStyle w:val="Compact"/>
         <w:numPr>
           <w:ilvl w:val="0"/>
           <w:numId w:val="1001"/>
         </w:numPr>
-        <w:pStyle w:val="Compact"/>
-      </w:pPr>
-      <w:r>
-        <w:t xml:space="preserve">Lead precision medicine data architecture and software initiatives across an innovation portfolio, translating scientific needs into scalable systems.</w:t>
-      </w:r>
-    </w:p>
-    <w:p>
-      <w:pPr>
+      </w:pPr>
+      <w:r>
+        <w:t xml:space="preserve">Lead precision medicine data architecture and software initiatives across an innovation portfolio, translating scientific and business needs into scalable systems.</w:t>
+      </w:r>
+    </w:p>
+    <w:p>
+      <w:pPr>
+        <w:pStyle w:val="Compact"/>
         <w:numPr>
           <w:ilvl w:val="0"/>
           <w:numId w:val="1001"/>
         </w:numPr>
-        <w:pStyle w:val="Compact"/>
       </w:pPr>
       <w:r>
         <w:t xml:space="preserve">Build and maintain production-grade software packages and data pipelines enabling clinical biomarker analysis at team scale.</w:t>
@@ -336,11 +341,11 @@
     </w:p>
     <w:p>
       <w:pPr>
+        <w:pStyle w:val="Compact"/>
         <w:numPr>
           <w:ilvl w:val="0"/>
           <w:numId w:val="1001"/>
         </w:numPr>
-        <w:pStyle w:val="Compact"/>
       </w:pPr>
       <w:r>
         <w:t xml:space="preserve">Automate portfolio and project reporting to provide senior leadership with real-time visibility into progress, risk, and impact.</w:t>
@@ -348,11 +353,11 @@
     </w:p>
     <w:p>
       <w:pPr>
+        <w:pStyle w:val="Compact"/>
         <w:numPr>
           <w:ilvl w:val="0"/>
           <w:numId w:val="1001"/>
         </w:numPr>
-        <w:pStyle w:val="Compact"/>
       </w:pPr>
       <w:r>
         <w:t xml:space="preserve">Rapidly prototype analytical applications and decision-support tools to accelerate stakeholder alignment and prioritization decisions.</w:t>
@@ -360,11 +365,11 @@
     </w:p>
     <w:p>
       <w:pPr>
+        <w:pStyle w:val="Compact"/>
         <w:numPr>
           <w:ilvl w:val="0"/>
           <w:numId w:val="1001"/>
         </w:numPr>
-        <w:pStyle w:val="Compact"/>
       </w:pPr>
       <w:r>
         <w:t xml:space="preserve">Mentor interns and data scientists in reproducible analytics and web-based tools, raising technical rigor and accelerating delivery across the team.</w:t>
@@ -385,13 +390,14 @@
       <w:r>
         <w:rPr>
           <w:b/>
+          <w:bCs/>
         </w:rPr>
         <w:t xml:space="preserve">Systems biologist</w:t>
       </w:r>
       <w:r>
         <w:t xml:space="preserve"> </w:t>
       </w:r>
-      <w:hyperlink r:id="rId28">
+      <w:hyperlink r:id="rId17">
         <w:r>
           <w:rPr>
             <w:rStyle w:val="Hyperlink"/>
@@ -405,11 +411,11 @@
     </w:p>
     <w:p>
       <w:pPr>
+        <w:pStyle w:val="Compact"/>
         <w:numPr>
           <w:ilvl w:val="0"/>
           <w:numId w:val="1002"/>
         </w:numPr>
-        <w:pStyle w:val="Compact"/>
       </w:pPr>
       <w:r>
         <w:t xml:space="preserve">Ph.D. Thesis:</w:t>
@@ -417,7 +423,7 @@
       <w:r>
         <w:t xml:space="preserve"> </w:t>
       </w:r>
-      <w:hyperlink r:id="rId29">
+      <w:hyperlink r:id="rId18">
         <w:r>
           <w:rPr>
             <w:rStyle w:val="Hyperlink"/>
@@ -428,13 +434,13 @@
     </w:p>
     <w:p>
       <w:pPr>
+        <w:pStyle w:val="Compact"/>
         <w:numPr>
           <w:ilvl w:val="0"/>
           <w:numId w:val="1002"/>
         </w:numPr>
-        <w:pStyle w:val="Compact"/>
-      </w:pPr>
-      <w:hyperlink r:id="rId30">
+      </w:pPr>
+      <w:hyperlink r:id="rId19">
         <w:r>
           <w:rPr>
             <w:rStyle w:val="Hyperlink"/>
@@ -445,13 +451,13 @@
     </w:p>
     <w:p>
       <w:pPr>
+        <w:pStyle w:val="Compact"/>
         <w:numPr>
           <w:ilvl w:val="0"/>
           <w:numId w:val="1002"/>
         </w:numPr>
-        <w:pStyle w:val="Compact"/>
-      </w:pPr>
-      <w:hyperlink r:id="rId31">
+      </w:pPr>
+      <w:hyperlink r:id="rId20">
         <w:r>
           <w:rPr>
             <w:rStyle w:val="Hyperlink"/>
@@ -462,13 +468,13 @@
     </w:p>
     <w:p>
       <w:pPr>
+        <w:pStyle w:val="Compact"/>
         <w:numPr>
           <w:ilvl w:val="0"/>
           <w:numId w:val="1002"/>
         </w:numPr>
-        <w:pStyle w:val="Compact"/>
-      </w:pPr>
-      <w:hyperlink r:id="rId32">
+      </w:pPr>
+      <w:hyperlink r:id="rId21">
         <w:r>
           <w:rPr>
             <w:rStyle w:val="Hyperlink"/>
@@ -479,13 +485,13 @@
     </w:p>
     <w:p>
       <w:pPr>
+        <w:pStyle w:val="Compact"/>
         <w:numPr>
           <w:ilvl w:val="0"/>
           <w:numId w:val="1002"/>
         </w:numPr>
-        <w:pStyle w:val="Compact"/>
-      </w:pPr>
-      <w:hyperlink r:id="rId33">
+      </w:pPr>
+      <w:hyperlink r:id="rId22">
         <w:r>
           <w:rPr>
             <w:rStyle w:val="Hyperlink"/>
@@ -496,11 +502,11 @@
     </w:p>
     <w:p>
       <w:pPr>
+        <w:pStyle w:val="Compact"/>
         <w:numPr>
           <w:ilvl w:val="0"/>
           <w:numId w:val="1002"/>
         </w:numPr>
-        <w:pStyle w:val="Compact"/>
       </w:pPr>
       <w:r>
         <w:t xml:space="preserve">Ceased Patent:</w:t>
@@ -508,7 +514,7 @@
       <w:r>
         <w:t xml:space="preserve"> </w:t>
       </w:r>
-      <w:hyperlink r:id="rId34">
+      <w:hyperlink r:id="rId23">
         <w:r>
           <w:rPr>
             <w:rStyle w:val="Hyperlink"/>
@@ -532,13 +538,14 @@
       <w:r>
         <w:rPr>
           <w:b/>
+          <w:bCs/>
         </w:rPr>
         <w:t xml:space="preserve">Bioinformatics intern</w:t>
       </w:r>
       <w:r>
         <w:t xml:space="preserve"> </w:t>
       </w:r>
-      <w:hyperlink r:id="rId35">
+      <w:hyperlink r:id="rId24">
         <w:r>
           <w:rPr>
             <w:rStyle w:val="Hyperlink"/>
@@ -581,13 +588,14 @@
       <w:r>
         <w:rPr>
           <w:b/>
+          <w:bCs/>
         </w:rPr>
         <w:t xml:space="preserve">Clinical informatics intern</w:t>
       </w:r>
       <w:r>
         <w:t xml:space="preserve"> </w:t>
       </w:r>
-      <w:hyperlink r:id="rId36">
+      <w:hyperlink r:id="rId25">
         <w:r>
           <w:rPr>
             <w:rStyle w:val="Hyperlink"/>
@@ -622,13 +630,14 @@
       <w:r>
         <w:rPr>
           <w:b/>
+          <w:bCs/>
         </w:rPr>
         <w:t xml:space="preserve">Computational biology intern</w:t>
       </w:r>
       <w:r>
         <w:t xml:space="preserve"> </w:t>
       </w:r>
-      <w:hyperlink r:id="rId37">
+      <w:hyperlink r:id="rId26">
         <w:r>
           <w:rPr>
             <w:rStyle w:val="Hyperlink"/>
@@ -671,13 +680,14 @@
       <w:r>
         <w:rPr>
           <w:b/>
+          <w:bCs/>
         </w:rPr>
         <w:t xml:space="preserve">Cancer bioinformatician</w:t>
       </w:r>
       <w:r>
         <w:t xml:space="preserve"> </w:t>
       </w:r>
-      <w:hyperlink r:id="rId38">
+      <w:hyperlink r:id="rId27">
         <w:r>
           <w:rPr>
             <w:rStyle w:val="Hyperlink"/>
@@ -705,8 +715,8 @@
         <w:t xml:space="preserve">Investigated ovarian endometrioid tumorigenesis by integrating and analyzing RNA-Seq and DNA methylation sequencing (MBD-Seq).</w:t>
       </w:r>
     </w:p>
-    <w:bookmarkEnd w:id="39"/>
-    <w:bookmarkStart w:id="42" w:name="education"/>
+    <w:bookmarkEnd w:id="28"/>
+    <w:bookmarkStart w:id="31" w:name="education"/>
     <w:p>
       <w:pPr>
         <w:pStyle w:val="Heading2"/>
@@ -727,11 +737,12 @@
       <w:pPr>
         <w:pStyle w:val="Definition"/>
       </w:pPr>
-      <w:hyperlink r:id="rId40">
+      <w:hyperlink r:id="rId29">
         <w:r>
           <w:rPr>
             <w:rStyle w:val="Hyperlink"/>
             <w:b/>
+            <w:bCs/>
           </w:rPr>
           <w:t xml:space="preserve">PhD, Systems Biology</w:t>
         </w:r>
@@ -766,7 +777,7 @@
       <w:r>
         <w:t xml:space="preserve"> </w:t>
       </w:r>
-      <w:hyperlink r:id="rId41">
+      <w:hyperlink r:id="rId30">
         <w:r>
           <w:rPr>
             <w:rStyle w:val="Hyperlink"/>
@@ -798,6 +809,7 @@
       <w:r>
         <w:rPr>
           <w:b/>
+          <w:bCs/>
         </w:rPr>
         <w:t xml:space="preserve">BS, Biochemistry</w:t>
       </w:r>
@@ -805,8 +817,8 @@
         <w:t xml:space="preserve">; University of Rochester, Rochester, NY</w:t>
       </w:r>
     </w:p>
-    <w:bookmarkEnd w:id="42"/>
-    <w:bookmarkStart w:id="58" w:name="select-publications"/>
+    <w:bookmarkEnd w:id="31"/>
+    <w:bookmarkStart w:id="47" w:name="select-publications"/>
     <w:p>
       <w:pPr>
         <w:pStyle w:val="Heading2"/>
@@ -825,11 +837,12 @@
       <w:r>
         <w:t xml:space="preserve"> </w:t>
       </w:r>
-      <w:hyperlink r:id="rId43">
+      <w:hyperlink r:id="rId32">
         <w:r>
           <w:rPr>
             <w:rStyle w:val="Hyperlink"/>
             <w:b/>
+            <w:bCs/>
           </w:rPr>
           <w:t xml:space="preserve">pubmed</w:t>
         </w:r>
@@ -843,11 +856,12 @@
       <w:r>
         <w:t xml:space="preserve"> </w:t>
       </w:r>
-      <w:hyperlink r:id="rId44">
+      <w:hyperlink r:id="rId33">
         <w:r>
           <w:rPr>
             <w:rStyle w:val="Hyperlink"/>
             <w:b/>
+            <w:bCs/>
           </w:rPr>
           <w:t xml:space="preserve">google scholar</w:t>
         </w:r>
@@ -855,11 +869,11 @@
     </w:p>
     <w:p>
       <w:pPr>
+        <w:pStyle w:val="Compact"/>
         <w:numPr>
           <w:ilvl w:val="0"/>
           <w:numId w:val="1003"/>
         </w:numPr>
-        <w:pStyle w:val="Compact"/>
       </w:pPr>
       <w:r>
         <w:t xml:space="preserve">Biswas S, Shahriar S,</w:t>
@@ -870,6 +884,7 @@
       <w:r>
         <w:rPr>
           <w:b/>
+          <w:bCs/>
         </w:rPr>
         <w:t xml:space="preserve">Giangreco NP</w:t>
       </w:r>
@@ -879,7 +894,7 @@
       <w:r>
         <w:t xml:space="preserve"> </w:t>
       </w:r>
-      <w:hyperlink r:id="rId45">
+      <w:hyperlink r:id="rId34">
         <w:r>
           <w:rPr>
             <w:rStyle w:val="Hyperlink"/>
@@ -893,15 +908,16 @@
     </w:p>
     <w:p>
       <w:pPr>
+        <w:pStyle w:val="Compact"/>
         <w:numPr>
           <w:ilvl w:val="0"/>
           <w:numId w:val="1003"/>
         </w:numPr>
-        <w:pStyle w:val="Compact"/>
       </w:pPr>
       <w:r>
         <w:rPr>
           <w:b/>
+          <w:bCs/>
         </w:rPr>
         <w:t xml:space="preserve">Giangreco, N.P.</w:t>
       </w:r>
@@ -911,7 +927,7 @@
       <w:r>
         <w:t xml:space="preserve"> </w:t>
       </w:r>
-      <w:hyperlink r:id="rId46">
+      <w:hyperlink r:id="rId35">
         <w:r>
           <w:rPr>
             <w:rStyle w:val="Hyperlink"/>
@@ -922,15 +938,16 @@
     </w:p>
     <w:p>
       <w:pPr>
+        <w:pStyle w:val="Compact"/>
         <w:numPr>
           <w:ilvl w:val="0"/>
           <w:numId w:val="1003"/>
         </w:numPr>
-        <w:pStyle w:val="Compact"/>
       </w:pPr>
       <w:r>
         <w:rPr>
           <w:b/>
+          <w:bCs/>
         </w:rPr>
         <w:t xml:space="preserve">Giangreco NP</w:t>
       </w:r>
@@ -940,7 +957,7 @@
       <w:r>
         <w:t xml:space="preserve"> </w:t>
       </w:r>
-      <w:hyperlink r:id="rId47">
+      <w:hyperlink r:id="rId36">
         <w:r>
           <w:rPr>
             <w:rStyle w:val="Hyperlink"/>
@@ -954,15 +971,16 @@
     </w:p>
     <w:p>
       <w:pPr>
+        <w:pStyle w:val="Compact"/>
         <w:numPr>
           <w:ilvl w:val="0"/>
           <w:numId w:val="1003"/>
         </w:numPr>
-        <w:pStyle w:val="Compact"/>
       </w:pPr>
       <w:r>
         <w:rPr>
           <w:b/>
+          <w:bCs/>
         </w:rPr>
         <w:t xml:space="preserve">Giangreco, Nicholas</w:t>
       </w:r>
@@ -975,7 +993,7 @@
       <w:r>
         <w:t xml:space="preserve"> </w:t>
       </w:r>
-      <w:hyperlink r:id="rId48">
+      <w:hyperlink r:id="rId37">
         <w:r>
           <w:rPr>
             <w:rStyle w:val="Hyperlink"/>
@@ -986,15 +1004,16 @@
     </w:p>
     <w:p>
       <w:pPr>
+        <w:pStyle w:val="Compact"/>
         <w:numPr>
           <w:ilvl w:val="0"/>
           <w:numId w:val="1003"/>
         </w:numPr>
-        <w:pStyle w:val="Compact"/>
       </w:pPr>
       <w:r>
         <w:rPr>
           <w:b/>
+          <w:bCs/>
         </w:rPr>
         <w:t xml:space="preserve">Nicholas P Giangreco</w:t>
       </w:r>
@@ -1004,7 +1023,7 @@
       <w:r>
         <w:t xml:space="preserve"> </w:t>
       </w:r>
-      <w:hyperlink r:id="rId49">
+      <w:hyperlink r:id="rId38">
         <w:r>
           <w:rPr>
             <w:rStyle w:val="Hyperlink"/>
@@ -1015,15 +1034,16 @@
     </w:p>
     <w:p>
       <w:pPr>
+        <w:pStyle w:val="Compact"/>
         <w:numPr>
           <w:ilvl w:val="0"/>
           <w:numId w:val="1003"/>
         </w:numPr>
-        <w:pStyle w:val="Compact"/>
       </w:pPr>
       <w:r>
         <w:rPr>
           <w:b/>
+          <w:bCs/>
         </w:rPr>
         <w:t xml:space="preserve">Giangreco NP</w:t>
       </w:r>
@@ -1033,7 +1053,7 @@
       <w:r>
         <w:t xml:space="preserve"> </w:t>
       </w:r>
-      <w:hyperlink r:id="rId50">
+      <w:hyperlink r:id="rId39">
         <w:r>
           <w:rPr>
             <w:rStyle w:val="Hyperlink"/>
@@ -1047,15 +1067,16 @@
     </w:p>
     <w:p>
       <w:pPr>
+        <w:pStyle w:val="Compact"/>
         <w:numPr>
           <w:ilvl w:val="0"/>
           <w:numId w:val="1003"/>
         </w:numPr>
-        <w:pStyle w:val="Compact"/>
       </w:pPr>
       <w:r>
         <w:rPr>
           <w:b/>
+          <w:bCs/>
         </w:rPr>
         <w:t xml:space="preserve">Giangreco, N.P.</w:t>
       </w:r>
@@ -1065,7 +1086,7 @@
       <w:r>
         <w:t xml:space="preserve"> </w:t>
       </w:r>
-      <w:hyperlink r:id="rId51">
+      <w:hyperlink r:id="rId40">
         <w:r>
           <w:rPr>
             <w:rStyle w:val="Hyperlink"/>
@@ -1079,15 +1100,16 @@
     </w:p>
     <w:p>
       <w:pPr>
+        <w:pStyle w:val="Compact"/>
         <w:numPr>
           <w:ilvl w:val="0"/>
           <w:numId w:val="1003"/>
         </w:numPr>
-        <w:pStyle w:val="Compact"/>
       </w:pPr>
       <w:r>
         <w:rPr>
           <w:b/>
+          <w:bCs/>
         </w:rPr>
         <w:t xml:space="preserve">Giangreco, NP</w:t>
       </w:r>
@@ -1097,7 +1119,7 @@
       <w:r>
         <w:t xml:space="preserve"> </w:t>
       </w:r>
-      <w:hyperlink r:id="rId52">
+      <w:hyperlink r:id="rId41">
         <w:r>
           <w:rPr>
             <w:rStyle w:val="Hyperlink"/>
@@ -1111,15 +1133,16 @@
     </w:p>
     <w:p>
       <w:pPr>
+        <w:pStyle w:val="Compact"/>
         <w:numPr>
           <w:ilvl w:val="0"/>
           <w:numId w:val="1003"/>
         </w:numPr>
-        <w:pStyle w:val="Compact"/>
       </w:pPr>
       <w:r>
         <w:rPr>
           <w:b/>
+          <w:bCs/>
         </w:rPr>
         <w:t xml:space="preserve">Nicholas P. Giangreco</w:t>
       </w:r>
@@ -1129,7 +1152,7 @@
       <w:r>
         <w:t xml:space="preserve"> </w:t>
       </w:r>
-      <w:hyperlink r:id="rId53">
+      <w:hyperlink r:id="rId42">
         <w:r>
           <w:rPr>
             <w:rStyle w:val="Hyperlink"/>
@@ -1140,11 +1163,11 @@
     </w:p>
     <w:p>
       <w:pPr>
+        <w:pStyle w:val="Compact"/>
         <w:numPr>
           <w:ilvl w:val="0"/>
           <w:numId w:val="1003"/>
         </w:numPr>
-        <w:pStyle w:val="Compact"/>
       </w:pPr>
       <w:r>
         <w:t xml:space="preserve">Benjamin S Glicksberg, Boris Oskotsky, Phyllis M Thangaraj,</w:t>
@@ -1155,6 +1178,7 @@
       <w:r>
         <w:rPr>
           <w:b/>
+          <w:bCs/>
         </w:rPr>
         <w:t xml:space="preserve">Nicholas Giangreco</w:t>
       </w:r>
@@ -1164,7 +1188,7 @@
       <w:r>
         <w:t xml:space="preserve"> </w:t>
       </w:r>
-      <w:hyperlink r:id="rId54">
+      <w:hyperlink r:id="rId43">
         <w:r>
           <w:rPr>
             <w:rStyle w:val="Hyperlink"/>
@@ -1178,11 +1202,11 @@
     </w:p>
     <w:p>
       <w:pPr>
+        <w:pStyle w:val="Compact"/>
         <w:numPr>
           <w:ilvl w:val="0"/>
           <w:numId w:val="1003"/>
         </w:numPr>
-        <w:pStyle w:val="Compact"/>
       </w:pPr>
       <w:r>
         <w:t xml:space="preserve">Benjamin S Glicksberg, Boris Oskotsky,</w:t>
@@ -1193,6 +1217,7 @@
       <w:r>
         <w:rPr>
           <w:b/>
+          <w:bCs/>
         </w:rPr>
         <w:t xml:space="preserve">Nicholas Giangreco</w:t>
       </w:r>
@@ -1202,7 +1227,7 @@
       <w:r>
         <w:t xml:space="preserve"> </w:t>
       </w:r>
-      <w:hyperlink r:id="rId55">
+      <w:hyperlink r:id="rId44">
         <w:r>
           <w:rPr>
             <w:rStyle w:val="Hyperlink"/>
@@ -1213,11 +1238,11 @@
     </w:p>
     <w:p>
       <w:pPr>
+        <w:pStyle w:val="Compact"/>
         <w:numPr>
           <w:ilvl w:val="0"/>
           <w:numId w:val="1003"/>
         </w:numPr>
-        <w:pStyle w:val="Compact"/>
       </w:pPr>
       <w:r>
         <w:t xml:space="preserve">Estibaliz Castillero, Ziad A. Ali, Hirokazu Akashi,</w:t>
@@ -1228,6 +1253,7 @@
       <w:r>
         <w:rPr>
           <w:b/>
+          <w:bCs/>
         </w:rPr>
         <w:t xml:space="preserve">Nicholas Giangreco</w:t>
       </w:r>
@@ -1237,7 +1263,7 @@
       <w:r>
         <w:t xml:space="preserve"> </w:t>
       </w:r>
-      <w:hyperlink r:id="rId56">
+      <w:hyperlink r:id="rId45">
         <w:r>
           <w:rPr>
             <w:rStyle w:val="Hyperlink"/>
@@ -1251,11 +1277,11 @@
     </w:p>
     <w:p>
       <w:pPr>
+        <w:pStyle w:val="Compact"/>
         <w:numPr>
           <w:ilvl w:val="0"/>
           <w:numId w:val="1003"/>
         </w:numPr>
-        <w:pStyle w:val="Compact"/>
       </w:pPr>
       <w:r>
         <w:t xml:space="preserve">Kim-Hellmuth, S., Bechheim, M., Pütz, B., Mohammadi, P., Néd´lec, Y,</w:t>
@@ -1266,6 +1292,7 @@
       <w:r>
         <w:rPr>
           <w:b/>
+          <w:bCs/>
         </w:rPr>
         <w:t xml:space="preserve">Giangreco, N.</w:t>
       </w:r>
@@ -1275,7 +1302,7 @@
       <w:r>
         <w:t xml:space="preserve"> </w:t>
       </w:r>
-      <w:hyperlink r:id="rId57">
+      <w:hyperlink r:id="rId46">
         <w:r>
           <w:rPr>
             <w:rStyle w:val="Hyperlink"/>
@@ -1287,8 +1314,8 @@
         <w:t xml:space="preserve">.</w:t>
       </w:r>
     </w:p>
-    <w:bookmarkEnd w:id="58"/>
-    <w:bookmarkStart w:id="61" w:name="fellowships-and-awards"/>
+    <w:bookmarkEnd w:id="47"/>
+    <w:bookmarkStart w:id="50" w:name="fellowships-and-awards"/>
     <w:p>
       <w:pPr>
         <w:pStyle w:val="Heading2"/>
@@ -1365,7 +1392,7 @@
       <w:r>
         <w:t xml:space="preserve"> </w:t>
       </w:r>
-      <w:hyperlink r:id="rId59">
+      <w:hyperlink r:id="rId48">
         <w:r>
           <w:rPr>
             <w:rStyle w:val="Hyperlink"/>
@@ -1382,7 +1409,7 @@
       <w:r>
         <w:t xml:space="preserve"> </w:t>
       </w:r>
-      <w:hyperlink r:id="rId60">
+      <w:hyperlink r:id="rId49">
         <w:r>
           <w:rPr>
             <w:rStyle w:val="Hyperlink"/>
@@ -1438,22 +1465,7 @@
         </w:numPr>
       </w:pPr>
       <w:r>
-        <w:t xml:space="preserve">Fulbright Fellowship Alternate 2013-2014: Sweden, Molecular Modeling,</w:t>
-      </w:r>
-      <w:r>
-        <w:t xml:space="preserve"> </w:t>
-      </w:r>
-      <w:r>
-        <w:t xml:space="preserve">“</w:t>
-      </w:r>
-      <w:r>
-        <w:t xml:space="preserve">Novel Antibody-SpA Complex Modeling</w:t>
-      </w:r>
-      <w:r>
-        <w:t xml:space="preserve">”</w:t>
-      </w:r>
-      <w:r>
-        <w:t xml:space="preserve">.</w:t>
+        <w:t xml:space="preserve">Fulbright Fellowship Alternate 2013-2014: Sweden, Molecular Modeling, “Novel Antibody-SpA Complex Modeling”.</w:t>
       </w:r>
     </w:p>
     <w:p>
@@ -1476,8 +1488,8 @@
         <w:t xml:space="preserve">Student Council and ISMB/ECCB conference 2013 Berlin, Germany.</w:t>
       </w:r>
     </w:p>
-    <w:bookmarkEnd w:id="61"/>
-    <w:bookmarkStart w:id="70" w:name="posters-and-software"/>
+    <w:bookmarkEnd w:id="50"/>
+    <w:bookmarkStart w:id="59" w:name="posters-and-software"/>
     <w:p>
       <w:pPr>
         <w:pStyle w:val="Heading2"/>
@@ -1488,15 +1500,16 @@
     </w:p>
     <w:p>
       <w:pPr>
+        <w:pStyle w:val="Compact"/>
         <w:numPr>
           <w:ilvl w:val="0"/>
           <w:numId w:val="1005"/>
         </w:numPr>
-        <w:pStyle w:val="Compact"/>
       </w:pPr>
       <w:r>
         <w:rPr>
           <w:b/>
+          <w:bCs/>
         </w:rPr>
         <w:t xml:space="preserve">Nicholas Giangreco</w:t>
       </w:r>
@@ -1506,7 +1519,7 @@
       <w:r>
         <w:t xml:space="preserve"> </w:t>
       </w:r>
-      <w:hyperlink r:id="rId62">
+      <w:hyperlink r:id="rId51">
         <w:r>
           <w:rPr>
             <w:rStyle w:val="Hyperlink"/>
@@ -1517,15 +1530,16 @@
     </w:p>
     <w:p>
       <w:pPr>
+        <w:pStyle w:val="Compact"/>
         <w:numPr>
           <w:ilvl w:val="0"/>
           <w:numId w:val="1005"/>
         </w:numPr>
-        <w:pStyle w:val="Compact"/>
       </w:pPr>
       <w:r>
         <w:rPr>
           <w:b/>
+          <w:bCs/>
         </w:rPr>
         <w:t xml:space="preserve">Nick Giangreco</w:t>
       </w:r>
@@ -1538,7 +1552,7 @@
       <w:r>
         <w:t xml:space="preserve"> </w:t>
       </w:r>
-      <w:hyperlink r:id="rId63">
+      <w:hyperlink r:id="rId52">
         <w:r>
           <w:rPr>
             <w:rStyle w:val="Hyperlink"/>
@@ -1549,7 +1563,7 @@
       <w:r>
         <w:t xml:space="preserve"> </w:t>
       </w:r>
-      <w:hyperlink r:id="rId64">
+      <w:hyperlink r:id="rId53">
         <w:r>
           <w:rPr>
             <w:rStyle w:val="Hyperlink"/>
@@ -1560,15 +1574,16 @@
     </w:p>
     <w:p>
       <w:pPr>
+        <w:pStyle w:val="Compact"/>
         <w:numPr>
           <w:ilvl w:val="0"/>
           <w:numId w:val="1005"/>
         </w:numPr>
-        <w:pStyle w:val="Compact"/>
       </w:pPr>
       <w:r>
         <w:rPr>
           <w:b/>
+          <w:bCs/>
         </w:rPr>
         <w:t xml:space="preserve">Nick Giangreco</w:t>
       </w:r>
@@ -1581,7 +1596,7 @@
       <w:r>
         <w:t xml:space="preserve"> </w:t>
       </w:r>
-      <w:hyperlink r:id="rId65">
+      <w:hyperlink r:id="rId54">
         <w:r>
           <w:rPr>
             <w:rStyle w:val="Hyperlink"/>
@@ -1592,15 +1607,16 @@
     </w:p>
     <w:p>
       <w:pPr>
+        <w:pStyle w:val="Compact"/>
         <w:numPr>
           <w:ilvl w:val="0"/>
           <w:numId w:val="1005"/>
         </w:numPr>
-        <w:pStyle w:val="Compact"/>
       </w:pPr>
       <w:r>
         <w:rPr>
           <w:b/>
+          <w:bCs/>
         </w:rPr>
         <w:t xml:space="preserve">Nick Giangreco</w:t>
       </w:r>
@@ -1613,7 +1629,7 @@
       <w:r>
         <w:t xml:space="preserve"> </w:t>
       </w:r>
-      <w:hyperlink r:id="rId66">
+      <w:hyperlink r:id="rId55">
         <w:r>
           <w:rPr>
             <w:rStyle w:val="Hyperlink"/>
@@ -1624,15 +1640,16 @@
     </w:p>
     <w:p>
       <w:pPr>
+        <w:pStyle w:val="Compact"/>
         <w:numPr>
           <w:ilvl w:val="0"/>
           <w:numId w:val="1005"/>
         </w:numPr>
-        <w:pStyle w:val="Compact"/>
       </w:pPr>
       <w:r>
         <w:rPr>
           <w:b/>
+          <w:bCs/>
         </w:rPr>
         <w:t xml:space="preserve">Nick Giangreco</w:t>
       </w:r>
@@ -1642,7 +1659,7 @@
       <w:r>
         <w:t xml:space="preserve"> </w:t>
       </w:r>
-      <w:hyperlink r:id="rId67">
+      <w:hyperlink r:id="rId56">
         <w:r>
           <w:rPr>
             <w:rStyle w:val="Hyperlink"/>
@@ -1653,15 +1670,16 @@
     </w:p>
     <w:p>
       <w:pPr>
+        <w:pStyle w:val="Compact"/>
         <w:numPr>
           <w:ilvl w:val="0"/>
           <w:numId w:val="1005"/>
         </w:numPr>
-        <w:pStyle w:val="Compact"/>
       </w:pPr>
       <w:r>
         <w:rPr>
           <w:b/>
+          <w:bCs/>
         </w:rPr>
         <w:t xml:space="preserve">Giangreco N</w:t>
       </w:r>
@@ -1671,7 +1689,7 @@
       <w:r>
         <w:t xml:space="preserve"> </w:t>
       </w:r>
-      <w:hyperlink r:id="rId68">
+      <w:hyperlink r:id="rId57">
         <w:r>
           <w:rPr>
             <w:rStyle w:val="Hyperlink"/>
@@ -1688,15 +1706,16 @@
     </w:p>
     <w:p>
       <w:pPr>
+        <w:pStyle w:val="Compact"/>
         <w:numPr>
           <w:ilvl w:val="0"/>
           <w:numId w:val="1005"/>
         </w:numPr>
-        <w:pStyle w:val="Compact"/>
       </w:pPr>
       <w:r>
         <w:rPr>
           <w:b/>
+          <w:bCs/>
         </w:rPr>
         <w:t xml:space="preserve">Giangreco N</w:t>
       </w:r>
@@ -1709,7 +1728,7 @@
       <w:r>
         <w:t xml:space="preserve"> </w:t>
       </w:r>
-      <w:hyperlink r:id="rId69">
+      <w:hyperlink r:id="rId58">
         <w:r>
           <w:rPr>
             <w:rStyle w:val="Hyperlink"/>
@@ -1721,8 +1740,8 @@
         <w:t xml:space="preserve">.</w:t>
       </w:r>
     </w:p>
-    <w:bookmarkEnd w:id="70"/>
-    <w:bookmarkStart w:id="79" w:name="leadership-and-management-experience"/>
+    <w:bookmarkEnd w:id="59"/>
+    <w:bookmarkStart w:id="68" w:name="leadership-and-management-experience"/>
     <w:p>
       <w:pPr>
         <w:pStyle w:val="Heading2"/>
@@ -1733,11 +1752,11 @@
     </w:p>
     <w:p>
       <w:pPr>
+        <w:pStyle w:val="Compact"/>
         <w:numPr>
           <w:ilvl w:val="0"/>
           <w:numId w:val="1006"/>
         </w:numPr>
-        <w:pStyle w:val="Compact"/>
       </w:pPr>
       <w:r>
         <w:t xml:space="preserve">University of Rochester Alumni Buffalo Leadership Council 2023-Present</w:t>
@@ -1745,11 +1764,11 @@
     </w:p>
     <w:p>
       <w:pPr>
+        <w:pStyle w:val="Compact"/>
         <w:numPr>
           <w:ilvl w:val="1"/>
           <w:numId w:val="1007"/>
         </w:numPr>
-        <w:pStyle w:val="Compact"/>
       </w:pPr>
       <w:r>
         <w:t xml:space="preserve">Ideate and organize local events</w:t>
@@ -1757,13 +1776,13 @@
     </w:p>
     <w:p>
       <w:pPr>
+        <w:pStyle w:val="Compact"/>
         <w:numPr>
           <w:ilvl w:val="0"/>
           <w:numId w:val="1006"/>
         </w:numPr>
-        <w:pStyle w:val="Compact"/>
-      </w:pPr>
-      <w:hyperlink r:id="rId71">
+      </w:pPr>
+      <w:hyperlink r:id="rId60">
         <w:r>
           <w:rPr>
             <w:rStyle w:val="Hyperlink"/>
@@ -1780,11 +1799,11 @@
     </w:p>
     <w:p>
       <w:pPr>
+        <w:pStyle w:val="Compact"/>
         <w:numPr>
           <w:ilvl w:val="1"/>
           <w:numId w:val="1008"/>
         </w:numPr>
-        <w:pStyle w:val="Compact"/>
       </w:pPr>
       <w:r>
         <w:t xml:space="preserve">501(c)(3) not-for-profit Cofounder and Secretary, 2019-2024</w:t>
@@ -1792,11 +1811,11 @@
     </w:p>
     <w:p>
       <w:pPr>
+        <w:pStyle w:val="Compact"/>
         <w:numPr>
           <w:ilvl w:val="1"/>
           <w:numId w:val="1008"/>
         </w:numPr>
-        <w:pStyle w:val="Compact"/>
       </w:pPr>
       <w:r>
         <w:t xml:space="preserve">Promote public discourse on a wide range of topics such as AI &amp; Society, AI &amp; Healthcare, and economic impact by AI.</w:t>
@@ -1804,11 +1823,11 @@
     </w:p>
     <w:p>
       <w:pPr>
+        <w:pStyle w:val="Compact"/>
         <w:numPr>
           <w:ilvl w:val="1"/>
           <w:numId w:val="1008"/>
         </w:numPr>
-        <w:pStyle w:val="Compact"/>
       </w:pPr>
       <w:r>
         <w:t xml:space="preserve">Organize and facilitate group engagement, workshops, AI study groups, and not-for-profit organization.</w:t>
@@ -1816,11 +1835,11 @@
     </w:p>
     <w:p>
       <w:pPr>
+        <w:pStyle w:val="Compact"/>
         <w:numPr>
           <w:ilvl w:val="1"/>
           <w:numId w:val="1008"/>
         </w:numPr>
-        <w:pStyle w:val="Compact"/>
       </w:pPr>
       <w:r>
         <w:t xml:space="preserve">Consultant on data science and education projects and initiatives.</w:t>
@@ -1828,11 +1847,11 @@
     </w:p>
     <w:p>
       <w:pPr>
+        <w:pStyle w:val="Compact"/>
         <w:numPr>
           <w:ilvl w:val="0"/>
           <w:numId w:val="1006"/>
         </w:numPr>
-        <w:pStyle w:val="Compact"/>
       </w:pPr>
       <w:r>
         <w:t xml:space="preserve">University of Rochester Alumni Undergraduate Interviewer 2016-2022</w:t>
@@ -1840,11 +1859,11 @@
     </w:p>
     <w:p>
       <w:pPr>
+        <w:pStyle w:val="Compact"/>
         <w:numPr>
           <w:ilvl w:val="1"/>
           <w:numId w:val="1009"/>
         </w:numPr>
-        <w:pStyle w:val="Compact"/>
       </w:pPr>
       <w:r>
         <w:t xml:space="preserve">Assess potential and suitability for undergraduate college</w:t>
@@ -1852,11 +1871,11 @@
     </w:p>
     <w:p>
       <w:pPr>
+        <w:pStyle w:val="Compact"/>
         <w:numPr>
           <w:ilvl w:val="1"/>
           <w:numId w:val="1009"/>
         </w:numPr>
-        <w:pStyle w:val="Compact"/>
       </w:pPr>
       <w:r>
         <w:t xml:space="preserve">Interviewer at large and small event settings</w:t>
@@ -1864,13 +1883,13 @@
     </w:p>
     <w:p>
       <w:pPr>
+        <w:pStyle w:val="Compact"/>
         <w:numPr>
           <w:ilvl w:val="0"/>
           <w:numId w:val="1006"/>
         </w:numPr>
-        <w:pStyle w:val="Compact"/>
-      </w:pPr>
-      <w:hyperlink r:id="rId72">
+      </w:pPr>
+      <w:hyperlink r:id="rId61">
         <w:r>
           <w:rPr>
             <w:rStyle w:val="Hyperlink"/>
@@ -1881,11 +1900,11 @@
     </w:p>
     <w:p>
       <w:pPr>
+        <w:pStyle w:val="Compact"/>
         <w:numPr>
           <w:ilvl w:val="1"/>
           <w:numId w:val="1010"/>
         </w:numPr>
-        <w:pStyle w:val="Compact"/>
       </w:pPr>
       <w:r>
         <w:t xml:space="preserve">Member January 2021-December 2021</w:t>
@@ -1893,11 +1912,11 @@
     </w:p>
     <w:p>
       <w:pPr>
+        <w:pStyle w:val="Compact"/>
         <w:numPr>
           <w:ilvl w:val="1"/>
           <w:numId w:val="1010"/>
         </w:numPr>
-        <w:pStyle w:val="Compact"/>
       </w:pPr>
       <w:r>
         <w:t xml:space="preserve">Read and discuss publications, books, and policy on fairness and ethics within informatics development and their application</w:t>
@@ -1905,13 +1924,13 @@
     </w:p>
     <w:p>
       <w:pPr>
+        <w:pStyle w:val="Compact"/>
         <w:numPr>
           <w:ilvl w:val="0"/>
           <w:numId w:val="1006"/>
         </w:numPr>
-        <w:pStyle w:val="Compact"/>
-      </w:pPr>
-      <w:hyperlink r:id="rId73">
+      </w:pPr>
+      <w:hyperlink r:id="rId62">
         <w:r>
           <w:rPr>
             <w:rStyle w:val="Hyperlink"/>
@@ -1922,11 +1941,11 @@
     </w:p>
     <w:p>
       <w:pPr>
+        <w:pStyle w:val="Compact"/>
         <w:numPr>
           <w:ilvl w:val="1"/>
           <w:numId w:val="1011"/>
         </w:numPr>
-        <w:pStyle w:val="Compact"/>
       </w:pPr>
       <w:r>
         <w:t xml:space="preserve">President 2017-2021</w:t>
@@ -1934,11 +1953,11 @@
     </w:p>
     <w:p>
       <w:pPr>
+        <w:pStyle w:val="Compact"/>
         <w:numPr>
           <w:ilvl w:val="1"/>
           <w:numId w:val="1011"/>
         </w:numPr>
-        <w:pStyle w:val="Compact"/>
       </w:pPr>
       <w:r>
         <w:t xml:space="preserve">Organize and manage team of officers, oversee activities, manage budget, and promote outreach portfolio to support and strengthen the data science skills of biomedical scientists at CUIMC</w:t>
@@ -1946,13 +1965,13 @@
     </w:p>
     <w:p>
       <w:pPr>
+        <w:pStyle w:val="Compact"/>
         <w:numPr>
           <w:ilvl w:val="0"/>
           <w:numId w:val="1006"/>
         </w:numPr>
-        <w:pStyle w:val="Compact"/>
-      </w:pPr>
-      <w:hyperlink r:id="rId74">
+      </w:pPr>
+      <w:hyperlink r:id="rId63">
         <w:r>
           <w:rPr>
             <w:rStyle w:val="Hyperlink"/>
@@ -1963,11 +1982,11 @@
     </w:p>
     <w:p>
       <w:pPr>
+        <w:pStyle w:val="Compact"/>
         <w:numPr>
           <w:ilvl w:val="1"/>
           <w:numId w:val="1012"/>
         </w:numPr>
-        <w:pStyle w:val="Compact"/>
       </w:pPr>
       <w:r>
         <w:t xml:space="preserve">President 2019-2020</w:t>
@@ -1975,11 +1994,11 @@
     </w:p>
     <w:p>
       <w:pPr>
+        <w:pStyle w:val="Compact"/>
         <w:numPr>
           <w:ilvl w:val="2"/>
           <w:numId w:val="1013"/>
         </w:numPr>
-        <w:pStyle w:val="Compact"/>
       </w:pPr>
       <w:r>
         <w:t xml:space="preserve">Manage business, medical, public health, and engineering representatives for inter-school events, panels, and conferences at Columbia.</w:t>
@@ -1987,11 +2006,11 @@
     </w:p>
     <w:p>
       <w:pPr>
+        <w:pStyle w:val="Compact"/>
         <w:numPr>
           <w:ilvl w:val="2"/>
           <w:numId w:val="1013"/>
         </w:numPr>
-        <w:pStyle w:val="Compact"/>
       </w:pPr>
       <w:r>
         <w:t xml:space="preserve">Organize and plan professional/social engagement events.</w:t>
@@ -1999,11 +2018,11 @@
     </w:p>
     <w:p>
       <w:pPr>
+        <w:pStyle w:val="Compact"/>
         <w:numPr>
           <w:ilvl w:val="2"/>
           <w:numId w:val="1013"/>
         </w:numPr>
-        <w:pStyle w:val="Compact"/>
       </w:pPr>
       <w:r>
         <w:t xml:space="preserve">Network and connect with NYC-wide entrepreneurs and professionals.</w:t>
@@ -2011,11 +2030,11 @@
     </w:p>
     <w:p>
       <w:pPr>
+        <w:pStyle w:val="Compact"/>
         <w:numPr>
           <w:ilvl w:val="1"/>
           <w:numId w:val="1012"/>
         </w:numPr>
-        <w:pStyle w:val="Compact"/>
       </w:pPr>
       <w:r>
         <w:t xml:space="preserve">Medical campus representative 2018-2019</w:t>
@@ -2023,13 +2042,13 @@
     </w:p>
     <w:p>
       <w:pPr>
+        <w:pStyle w:val="Compact"/>
         <w:numPr>
           <w:ilvl w:val="0"/>
           <w:numId w:val="1006"/>
         </w:numPr>
-        <w:pStyle w:val="Compact"/>
-      </w:pPr>
-      <w:hyperlink r:id="rId75">
+      </w:pPr>
+      <w:hyperlink r:id="rId64">
         <w:r>
           <w:rPr>
             <w:rStyle w:val="Hyperlink"/>
@@ -2040,11 +2059,11 @@
     </w:p>
     <w:p>
       <w:pPr>
+        <w:pStyle w:val="Compact"/>
         <w:numPr>
           <w:ilvl w:val="1"/>
           <w:numId w:val="1014"/>
         </w:numPr>
-        <w:pStyle w:val="Compact"/>
       </w:pPr>
       <w:r>
         <w:t xml:space="preserve">Co-President 2019-2020</w:t>
@@ -2052,11 +2071,11 @@
     </w:p>
     <w:p>
       <w:pPr>
+        <w:pStyle w:val="Compact"/>
         <w:numPr>
           <w:ilvl w:val="2"/>
           <w:numId w:val="1015"/>
         </w:numPr>
-        <w:pStyle w:val="Compact"/>
       </w:pPr>
       <w:r>
         <w:t xml:space="preserve">Organize and manage team of Biomedical PhDs for social and professional activities serving hundreds of CUIMC PhD students.</w:t>
@@ -2064,11 +2083,11 @@
     </w:p>
     <w:p>
       <w:pPr>
+        <w:pStyle w:val="Compact"/>
         <w:numPr>
           <w:ilvl w:val="1"/>
           <w:numId w:val="1014"/>
         </w:numPr>
-        <w:pStyle w:val="Compact"/>
       </w:pPr>
       <w:r>
         <w:t xml:space="preserve">Finance Chair 2018-2019</w:t>
@@ -2076,13 +2095,13 @@
     </w:p>
     <w:p>
       <w:pPr>
+        <w:pStyle w:val="Compact"/>
         <w:numPr>
           <w:ilvl w:val="0"/>
           <w:numId w:val="1006"/>
         </w:numPr>
-        <w:pStyle w:val="Compact"/>
-      </w:pPr>
-      <w:hyperlink r:id="rId76">
+      </w:pPr>
+      <w:hyperlink r:id="rId65">
         <w:r>
           <w:rPr>
             <w:rStyle w:val="Hyperlink"/>
@@ -2093,11 +2112,11 @@
     </w:p>
     <w:p>
       <w:pPr>
+        <w:pStyle w:val="Compact"/>
         <w:numPr>
           <w:ilvl w:val="1"/>
           <w:numId w:val="1016"/>
         </w:numPr>
-        <w:pStyle w:val="Compact"/>
       </w:pPr>
       <w:r>
         <w:t xml:space="preserve">Treasurer 2019-2020</w:t>
@@ -2105,11 +2124,11 @@
     </w:p>
     <w:p>
       <w:pPr>
+        <w:pStyle w:val="Compact"/>
         <w:numPr>
           <w:ilvl w:val="2"/>
           <w:numId w:val="1017"/>
         </w:numPr>
-        <w:pStyle w:val="Compact"/>
       </w:pPr>
       <w:r>
         <w:t xml:space="preserve">Establish budget and expense sheets and annual reports</w:t>
@@ -2117,11 +2136,11 @@
     </w:p>
     <w:p>
       <w:pPr>
+        <w:pStyle w:val="Compact"/>
         <w:numPr>
           <w:ilvl w:val="2"/>
           <w:numId w:val="1017"/>
         </w:numPr>
-        <w:pStyle w:val="Compact"/>
       </w:pPr>
       <w:r>
         <w:t xml:space="preserve">Manage forty thousand dollar budget for Columbia inter-school activities.</w:t>
@@ -2129,13 +2148,13 @@
     </w:p>
     <w:p>
       <w:pPr>
+        <w:pStyle w:val="Compact"/>
         <w:numPr>
           <w:ilvl w:val="0"/>
           <w:numId w:val="1006"/>
         </w:numPr>
-        <w:pStyle w:val="Compact"/>
-      </w:pPr>
-      <w:hyperlink r:id="rId77">
+      </w:pPr>
+      <w:hyperlink r:id="rId66">
         <w:r>
           <w:rPr>
             <w:rStyle w:val="Hyperlink"/>
@@ -2146,11 +2165,11 @@
     </w:p>
     <w:p>
       <w:pPr>
+        <w:pStyle w:val="Compact"/>
         <w:numPr>
           <w:ilvl w:val="1"/>
           <w:numId w:val="1018"/>
         </w:numPr>
-        <w:pStyle w:val="Compact"/>
       </w:pPr>
       <w:r>
         <w:t xml:space="preserve">Co-lead weekly seminar series</w:t>
@@ -2158,11 +2177,11 @@
     </w:p>
     <w:p>
       <w:pPr>
+        <w:pStyle w:val="Compact"/>
         <w:numPr>
           <w:ilvl w:val="1"/>
           <w:numId w:val="1018"/>
         </w:numPr>
-        <w:pStyle w:val="Compact"/>
       </w:pPr>
       <w:r>
         <w:t xml:space="preserve">Manage presentation schedule, speaker logistics and travel, and promote team coordination.</w:t>
@@ -2170,13 +2189,13 @@
     </w:p>
     <w:p>
       <w:pPr>
+        <w:pStyle w:val="Compact"/>
         <w:numPr>
           <w:ilvl w:val="0"/>
           <w:numId w:val="1006"/>
         </w:numPr>
-        <w:pStyle w:val="Compact"/>
-      </w:pPr>
-      <w:hyperlink r:id="rId78">
+      </w:pPr>
+      <w:hyperlink r:id="rId67">
         <w:r>
           <w:rPr>
             <w:rStyle w:val="Hyperlink"/>
@@ -2187,11 +2206,11 @@
     </w:p>
     <w:p>
       <w:pPr>
+        <w:pStyle w:val="Compact"/>
         <w:numPr>
           <w:ilvl w:val="1"/>
           <w:numId w:val="1019"/>
         </w:numPr>
-        <w:pStyle w:val="Compact"/>
       </w:pPr>
       <w:r>
         <w:t xml:space="preserve">Point person for Systems Biology Trainee Council</w:t>
@@ -2199,11 +2218,11 @@
     </w:p>
     <w:p>
       <w:pPr>
+        <w:pStyle w:val="Compact"/>
         <w:numPr>
           <w:ilvl w:val="1"/>
           <w:numId w:val="1019"/>
         </w:numPr>
-        <w:pStyle w:val="Compact"/>
       </w:pPr>
       <w:r>
         <w:t xml:space="preserve">Secured funding and launched event portfolio for trainee development</w:t>
@@ -2211,18 +2230,18 @@
     </w:p>
     <w:p>
       <w:pPr>
+        <w:pStyle w:val="Compact"/>
         <w:numPr>
           <w:ilvl w:val="1"/>
           <w:numId w:val="1019"/>
         </w:numPr>
-        <w:pStyle w:val="Compact"/>
       </w:pPr>
       <w:r>
         <w:t xml:space="preserve">Manage monthly departmental happy hours</w:t>
       </w:r>
     </w:p>
-    <w:bookmarkEnd w:id="79"/>
-    <w:bookmarkStart w:id="88" w:name="mentoring-tutoring-and-writing"/>
+    <w:bookmarkEnd w:id="68"/>
+    <w:bookmarkStart w:id="77" w:name="mentoring-tutoring-and-writing"/>
     <w:p>
       <w:pPr>
         <w:pStyle w:val="Heading2"/>
@@ -2233,11 +2252,11 @@
     </w:p>
     <w:p>
       <w:pPr>
+        <w:pStyle w:val="Compact"/>
         <w:numPr>
           <w:ilvl w:val="0"/>
           <w:numId w:val="1020"/>
         </w:numPr>
-        <w:pStyle w:val="Compact"/>
       </w:pPr>
       <w:r>
         <w:t xml:space="preserve">Mentor in the</w:t>
@@ -2245,7 +2264,7 @@
       <w:r>
         <w:t xml:space="preserve"> </w:t>
       </w:r>
-      <w:hyperlink r:id="rId80">
+      <w:hyperlink r:id="rId69">
         <w:r>
           <w:rPr>
             <w:rStyle w:val="Hyperlink"/>
@@ -2262,11 +2281,11 @@
     </w:p>
     <w:p>
       <w:pPr>
+        <w:pStyle w:val="Compact"/>
         <w:numPr>
           <w:ilvl w:val="1"/>
           <w:numId w:val="1021"/>
         </w:numPr>
-        <w:pStyle w:val="Compact"/>
       </w:pPr>
       <w:r>
         <w:t xml:space="preserve">Mission is to remove barriers to educational and economic attainment for our young people.</w:t>
@@ -2274,11 +2293,11 @@
     </w:p>
     <w:p>
       <w:pPr>
+        <w:pStyle w:val="Compact"/>
         <w:numPr>
           <w:ilvl w:val="0"/>
           <w:numId w:val="1020"/>
         </w:numPr>
-        <w:pStyle w:val="Compact"/>
       </w:pPr>
       <w:r>
         <w:t xml:space="preserve">Mentor in technical and entrepreneurship development for the</w:t>
@@ -2286,7 +2305,7 @@
       <w:r>
         <w:t xml:space="preserve"> </w:t>
       </w:r>
-      <w:hyperlink r:id="rId81">
+      <w:hyperlink r:id="rId70">
         <w:r>
           <w:rPr>
             <w:rStyle w:val="Hyperlink"/>
@@ -2297,11 +2316,11 @@
     </w:p>
     <w:p>
       <w:pPr>
+        <w:pStyle w:val="Compact"/>
         <w:numPr>
           <w:ilvl w:val="0"/>
           <w:numId w:val="1020"/>
         </w:numPr>
-        <w:pStyle w:val="Compact"/>
       </w:pPr>
       <w:r>
         <w:t xml:space="preserve">Advisor, mentor and tutor for project management, R and python programming, and statistics and machine learning to high school/college/graduate students and professionals.</w:t>
@@ -2309,30 +2328,18 @@
     </w:p>
     <w:p>
       <w:pPr>
+        <w:pStyle w:val="Compact"/>
         <w:numPr>
           <w:ilvl w:val="0"/>
           <w:numId w:val="1020"/>
         </w:numPr>
-        <w:pStyle w:val="Compact"/>
-      </w:pPr>
-      <w:hyperlink r:id="rId82">
-        <w:r>
-          <w:rPr>
-            <w:rStyle w:val="Hyperlink"/>
-          </w:rPr>
-          <w:t xml:space="preserve">“</w:t>
-        </w:r>
-        <w:r>
-          <w:rPr>
-            <w:rStyle w:val="Hyperlink"/>
-          </w:rPr>
-          <w:t xml:space="preserve">Hack nights – Solving healthcare data-science/AI/ML problems</w:t>
-        </w:r>
-        <w:r>
-          <w:rPr>
-            <w:rStyle w:val="Hyperlink"/>
-          </w:rPr>
-          <w:t xml:space="preserve">”</w:t>
+      </w:pPr>
+      <w:hyperlink r:id="rId71">
+        <w:r>
+          <w:rPr>
+            <w:rStyle w:val="Hyperlink"/>
+          </w:rPr>
+          <w:t xml:space="preserve">“Hack nights – Solving healthcare data-science/AI/ML problems”</w:t>
         </w:r>
       </w:hyperlink>
       <w:r>
@@ -2344,13 +2351,13 @@
     </w:p>
     <w:p>
       <w:pPr>
+        <w:pStyle w:val="Compact"/>
         <w:numPr>
           <w:ilvl w:val="1"/>
           <w:numId w:val="1022"/>
         </w:numPr>
-        <w:pStyle w:val="Compact"/>
-      </w:pPr>
-      <w:hyperlink r:id="rId83">
+      </w:pPr>
+      <w:hyperlink r:id="rId72">
         <w:r>
           <w:rPr>
             <w:rStyle w:val="Hyperlink"/>
@@ -2361,11 +2368,11 @@
     </w:p>
     <w:p>
       <w:pPr>
+        <w:pStyle w:val="Compact"/>
         <w:numPr>
           <w:ilvl w:val="0"/>
           <w:numId w:val="1020"/>
         </w:numPr>
-        <w:pStyle w:val="Compact"/>
       </w:pPr>
       <w:r>
         <w:t xml:space="preserve">Nicholas Giangreco.</w:t>
@@ -2373,24 +2380,12 @@
       <w:r>
         <w:t xml:space="preserve"> </w:t>
       </w:r>
-      <w:hyperlink r:id="rId84">
-        <w:r>
-          <w:rPr>
-            <w:rStyle w:val="Hyperlink"/>
-          </w:rPr>
-          <w:t xml:space="preserve">“</w:t>
-        </w:r>
-        <w:r>
-          <w:rPr>
-            <w:rStyle w:val="Hyperlink"/>
-          </w:rPr>
-          <w:t xml:space="preserve">The Importance of being Open</w:t>
-        </w:r>
-        <w:r>
-          <w:rPr>
-            <w:rStyle w:val="Hyperlink"/>
-          </w:rPr>
-          <w:t xml:space="preserve">”</w:t>
+      <w:hyperlink r:id="rId73">
+        <w:r>
+          <w:rPr>
+            <w:rStyle w:val="Hyperlink"/>
+          </w:rPr>
+          <w:t xml:space="preserve">“The Importance of being Open”</w:t>
         </w:r>
       </w:hyperlink>
       <w:r>
@@ -2402,6 +2397,7 @@
       <w:r>
         <w:rPr>
           <w:i/>
+          <w:iCs/>
         </w:rPr>
         <w:t xml:space="preserve">PHDISH</w:t>
       </w:r>
@@ -2414,11 +2410,11 @@
     </w:p>
     <w:p>
       <w:pPr>
+        <w:pStyle w:val="Compact"/>
         <w:numPr>
           <w:ilvl w:val="0"/>
           <w:numId w:val="1020"/>
         </w:numPr>
-        <w:pStyle w:val="Compact"/>
       </w:pPr>
       <w:r>
         <w:t xml:space="preserve">Mentoring:</w:t>
@@ -2426,13 +2422,13 @@
     </w:p>
     <w:p>
       <w:pPr>
+        <w:pStyle w:val="Compact"/>
         <w:numPr>
           <w:ilvl w:val="1"/>
           <w:numId w:val="1023"/>
         </w:numPr>
-        <w:pStyle w:val="Compact"/>
-      </w:pPr>
-      <w:hyperlink r:id="rId85">
+      </w:pPr>
+      <w:hyperlink r:id="rId74">
         <w:r>
           <w:rPr>
             <w:rStyle w:val="Hyperlink"/>
@@ -2446,11 +2442,11 @@
     </w:p>
     <w:p>
       <w:pPr>
+        <w:pStyle w:val="Compact"/>
         <w:numPr>
           <w:ilvl w:val="2"/>
           <w:numId w:val="1024"/>
         </w:numPr>
-        <w:pStyle w:val="Compact"/>
       </w:pPr>
       <w:r>
         <w:t xml:space="preserve">Provide guidance and instruction in biomedical data science and research training.</w:t>
@@ -2458,11 +2454,11 @@
     </w:p>
     <w:p>
       <w:pPr>
+        <w:pStyle w:val="Compact"/>
         <w:numPr>
           <w:ilvl w:val="2"/>
           <w:numId w:val="1024"/>
         </w:numPr>
-        <w:pStyle w:val="Compact"/>
       </w:pPr>
       <w:r>
         <w:t xml:space="preserve">Provided guidance and mentoring for summer 2018 research internship in the Tatonetti Lab</w:t>
@@ -2470,40 +2466,28 @@
     </w:p>
     <w:p>
       <w:pPr>
+        <w:pStyle w:val="Compact"/>
         <w:numPr>
           <w:ilvl w:val="3"/>
           <w:numId w:val="1025"/>
         </w:numPr>
-        <w:pStyle w:val="Compact"/>
-      </w:pPr>
-      <w:hyperlink r:id="rId86">
-        <w:r>
-          <w:rPr>
-            <w:rStyle w:val="Hyperlink"/>
-          </w:rPr>
-          <w:t xml:space="preserve">“</w:t>
-        </w:r>
-        <w:r>
-          <w:rPr>
-            <w:rStyle w:val="Hyperlink"/>
-          </w:rPr>
-          <w:t xml:space="preserve">Drugs with sex-linked risk for adverse drug reactions</w:t>
-        </w:r>
-        <w:r>
-          <w:rPr>
-            <w:rStyle w:val="Hyperlink"/>
-          </w:rPr>
-          <w:t xml:space="preserve">”</w:t>
-        </w:r>
-      </w:hyperlink>
-    </w:p>
-    <w:p>
-      <w:pPr>
+      </w:pPr>
+      <w:hyperlink r:id="rId75">
+        <w:r>
+          <w:rPr>
+            <w:rStyle w:val="Hyperlink"/>
+          </w:rPr>
+          <w:t xml:space="preserve">“Drugs with sex-linked risk for adverse drug reactions”</w:t>
+        </w:r>
+      </w:hyperlink>
+    </w:p>
+    <w:p>
+      <w:pPr>
+        <w:pStyle w:val="Compact"/>
         <w:numPr>
           <w:ilvl w:val="1"/>
           <w:numId w:val="1023"/>
         </w:numPr>
-        <w:pStyle w:val="Compact"/>
       </w:pPr>
       <w:r>
         <w:t xml:space="preserve">SMRI high school mentorship</w:t>
@@ -2511,11 +2495,11 @@
     </w:p>
     <w:p>
       <w:pPr>
+        <w:pStyle w:val="Compact"/>
         <w:numPr>
           <w:ilvl w:val="2"/>
           <w:numId w:val="1026"/>
         </w:numPr>
-        <w:pStyle w:val="Compact"/>
       </w:pPr>
       <w:r>
         <w:t xml:space="preserve">Provide guidance to high school student in</w:t>
@@ -2523,7 +2507,7 @@
       <w:r>
         <w:t xml:space="preserve"> </w:t>
       </w:r>
-      <w:hyperlink r:id="rId87">
+      <w:hyperlink r:id="rId76">
         <w:r>
           <w:rPr>
             <w:rStyle w:val="Hyperlink"/>
@@ -2534,11 +2518,11 @@
     </w:p>
     <w:p>
       <w:pPr>
+        <w:pStyle w:val="Compact"/>
         <w:numPr>
           <w:ilvl w:val="0"/>
           <w:numId w:val="1020"/>
         </w:numPr>
-        <w:pStyle w:val="Compact"/>
       </w:pPr>
       <w:r>
         <w:t xml:space="preserve">Curiology tutor</w:t>
@@ -2546,11 +2530,11 @@
     </w:p>
     <w:p>
       <w:pPr>
+        <w:pStyle w:val="Compact"/>
         <w:numPr>
           <w:ilvl w:val="1"/>
           <w:numId w:val="1027"/>
         </w:numPr>
-        <w:pStyle w:val="Compact"/>
       </w:pPr>
       <w:r>
         <w:t xml:space="preserve">Managed and co-led science experiments with NIH fellows for middle school students in Washington D.C.</w:t>
@@ -2558,11 +2542,11 @@
     </w:p>
     <w:p>
       <w:pPr>
+        <w:pStyle w:val="Compact"/>
         <w:numPr>
           <w:ilvl w:val="0"/>
           <w:numId w:val="1020"/>
         </w:numPr>
-        <w:pStyle w:val="Compact"/>
       </w:pPr>
       <w:r>
         <w:t xml:space="preserve">College Bound tutor</w:t>
@@ -2570,11 +2554,11 @@
     </w:p>
     <w:p>
       <w:pPr>
+        <w:pStyle w:val="Compact"/>
         <w:numPr>
           <w:ilvl w:val="1"/>
           <w:numId w:val="1028"/>
         </w:numPr>
-        <w:pStyle w:val="Compact"/>
       </w:pPr>
       <w:r>
         <w:t xml:space="preserve">Facilitated completion of homework assignments in STEM for Washington D.C. high school students.</w:t>
@@ -2582,18 +2566,18 @@
     </w:p>
     <w:p>
       <w:pPr>
+        <w:pStyle w:val="Compact"/>
         <w:numPr>
           <w:ilvl w:val="0"/>
           <w:numId w:val="1020"/>
         </w:numPr>
-        <w:pStyle w:val="Compact"/>
       </w:pPr>
       <w:r>
         <w:t xml:space="preserve">Genetics Study Group Leader, Center for Excellence in Teaching and Learning, University of Rochester.</w:t>
       </w:r>
     </w:p>
-    <w:bookmarkEnd w:id="88"/>
-    <w:bookmarkStart w:id="111" w:name="conferences-and-hackathons"/>
+    <w:bookmarkEnd w:id="77"/>
+    <w:bookmarkStart w:id="100" w:name="conferences-and-hackathons"/>
     <w:p>
       <w:pPr>
         <w:pStyle w:val="Heading2"/>
@@ -2609,7 +2593,7 @@
           <w:numId w:val="1029"/>
         </w:numPr>
       </w:pPr>
-      <w:hyperlink r:id="rId89">
+      <w:hyperlink r:id="rId78">
         <w:r>
           <w:rPr>
             <w:rStyle w:val="Hyperlink"/>
@@ -2625,7 +2609,7 @@
           <w:numId w:val="1029"/>
         </w:numPr>
       </w:pPr>
-      <w:hyperlink r:id="rId90">
+      <w:hyperlink r:id="rId79">
         <w:r>
           <w:rPr>
             <w:rStyle w:val="Hyperlink"/>
@@ -2641,7 +2625,7 @@
           <w:numId w:val="1029"/>
         </w:numPr>
       </w:pPr>
-      <w:hyperlink r:id="rId91">
+      <w:hyperlink r:id="rId80">
         <w:r>
           <w:rPr>
             <w:rStyle w:val="Hyperlink"/>
@@ -2657,7 +2641,7 @@
           <w:numId w:val="1029"/>
         </w:numPr>
       </w:pPr>
-      <w:hyperlink r:id="rId92">
+      <w:hyperlink r:id="rId81">
         <w:r>
           <w:rPr>
             <w:rStyle w:val="Hyperlink"/>
@@ -2668,11 +2652,11 @@
     </w:p>
     <w:p>
       <w:pPr>
+        <w:pStyle w:val="Compact"/>
         <w:numPr>
           <w:ilvl w:val="1"/>
           <w:numId w:val="1030"/>
         </w:numPr>
-        <w:pStyle w:val="Compact"/>
       </w:pPr>
       <w:r>
         <w:t xml:space="preserve">Front-end developer</w:t>
@@ -2680,11 +2664,11 @@
     </w:p>
     <w:p>
       <w:pPr>
+        <w:pStyle w:val="Compact"/>
         <w:numPr>
           <w:ilvl w:val="1"/>
           <w:numId w:val="1030"/>
         </w:numPr>
-        <w:pStyle w:val="Compact"/>
       </w:pPr>
       <w:r>
         <w:t xml:space="preserve">Built prototype dashboard for improved disease subtyping and treatment pathways for colorectal cancer. See</w:t>
@@ -2692,7 +2676,7 @@
       <w:r>
         <w:t xml:space="preserve"> </w:t>
       </w:r>
-      <w:hyperlink r:id="rId93">
+      <w:hyperlink r:id="rId82">
         <w:r>
           <w:rPr>
             <w:rStyle w:val="Hyperlink"/>
@@ -2709,7 +2693,7 @@
       <w:r>
         <w:t xml:space="preserve"> </w:t>
       </w:r>
-      <w:hyperlink r:id="rId94">
+      <w:hyperlink r:id="rId83">
         <w:r>
           <w:rPr>
             <w:rStyle w:val="Hyperlink"/>
@@ -2728,7 +2712,7 @@
           <w:numId w:val="1029"/>
         </w:numPr>
       </w:pPr>
-      <w:hyperlink r:id="rId95">
+      <w:hyperlink r:id="rId84">
         <w:r>
           <w:rPr>
             <w:rStyle w:val="Hyperlink"/>
@@ -2739,11 +2723,11 @@
     </w:p>
     <w:p>
       <w:pPr>
+        <w:pStyle w:val="Compact"/>
         <w:numPr>
           <w:ilvl w:val="1"/>
           <w:numId w:val="1031"/>
         </w:numPr>
-        <w:pStyle w:val="Compact"/>
       </w:pPr>
       <w:r>
         <w:t xml:space="preserve">Led team and managed hackathon teams to manage and streamline integration of genomic, transcriptomic, and polygenic risk score data into the OMOP common data model. See</w:t>
@@ -2751,7 +2735,7 @@
       <w:r>
         <w:t xml:space="preserve"> </w:t>
       </w:r>
-      <w:hyperlink r:id="rId96">
+      <w:hyperlink r:id="rId85">
         <w:r>
           <w:rPr>
             <w:rStyle w:val="Hyperlink"/>
@@ -2770,7 +2754,7 @@
           <w:numId w:val="1029"/>
         </w:numPr>
       </w:pPr>
-      <w:hyperlink r:id="rId97">
+      <w:hyperlink r:id="rId86">
         <w:r>
           <w:rPr>
             <w:rStyle w:val="Hyperlink"/>
@@ -2781,11 +2765,11 @@
     </w:p>
     <w:p>
       <w:pPr>
+        <w:pStyle w:val="Compact"/>
         <w:numPr>
           <w:ilvl w:val="1"/>
           <w:numId w:val="1032"/>
         </w:numPr>
-        <w:pStyle w:val="Compact"/>
       </w:pPr>
       <w:r>
         <w:t xml:space="preserve">Collaborated with bioinformatics team to integrate nextflow scheme and cancer mutation data (vcf files) into OMOP standard structure using</w:t>
@@ -2793,7 +2777,7 @@
       <w:r>
         <w:t xml:space="preserve"> </w:t>
       </w:r>
-      <w:hyperlink r:id="rId98">
+      <w:hyperlink r:id="rId87">
         <w:r>
           <w:rPr>
             <w:rStyle w:val="Hyperlink"/>
@@ -2812,7 +2796,7 @@
           <w:numId w:val="1029"/>
         </w:numPr>
       </w:pPr>
-      <w:hyperlink r:id="rId99">
+      <w:hyperlink r:id="rId88">
         <w:r>
           <w:rPr>
             <w:rStyle w:val="Hyperlink"/>
@@ -2823,11 +2807,11 @@
     </w:p>
     <w:p>
       <w:pPr>
+        <w:pStyle w:val="Compact"/>
         <w:numPr>
           <w:ilvl w:val="1"/>
           <w:numId w:val="1033"/>
         </w:numPr>
-        <w:pStyle w:val="Compact"/>
       </w:pPr>
       <w:r>
         <w:t xml:space="preserve">Co-lead web developer coordination and product development</w:t>
@@ -2835,11 +2819,11 @@
     </w:p>
     <w:p>
       <w:pPr>
+        <w:pStyle w:val="Compact"/>
         <w:numPr>
           <w:ilvl w:val="1"/>
           <w:numId w:val="1033"/>
         </w:numPr>
-        <w:pStyle w:val="Compact"/>
       </w:pPr>
       <w:r>
         <w:t xml:space="preserve">A FHIR-complient and primarily patient-centric profile for NF management and centralized repository for medical journey.</w:t>
@@ -2863,7 +2847,7 @@
           <w:numId w:val="1029"/>
         </w:numPr>
       </w:pPr>
-      <w:hyperlink r:id="rId100">
+      <w:hyperlink r:id="rId89">
         <w:r>
           <w:rPr>
             <w:rStyle w:val="Hyperlink"/>
@@ -2874,11 +2858,11 @@
     </w:p>
     <w:p>
       <w:pPr>
+        <w:pStyle w:val="Compact"/>
         <w:numPr>
           <w:ilvl w:val="1"/>
           <w:numId w:val="1034"/>
         </w:numPr>
-        <w:pStyle w:val="Compact"/>
       </w:pPr>
       <w:r>
         <w:t xml:space="preserve">Project developer for personalized health record accessed with fhir-client python api</w:t>
@@ -2886,11 +2870,11 @@
     </w:p>
     <w:p>
       <w:pPr>
+        <w:pStyle w:val="Compact"/>
         <w:numPr>
           <w:ilvl w:val="1"/>
           <w:numId w:val="1034"/>
         </w:numPr>
-        <w:pStyle w:val="Compact"/>
       </w:pPr>
       <w:r>
         <w:t xml:space="preserve">Developed flask application</w:t>
@@ -2898,7 +2882,7 @@
       <w:r>
         <w:t xml:space="preserve"> </w:t>
       </w:r>
-      <w:hyperlink r:id="rId101">
+      <w:hyperlink r:id="rId90">
         <w:r>
           <w:rPr>
             <w:rStyle w:val="Hyperlink"/>
@@ -2917,7 +2901,7 @@
           <w:numId w:val="1029"/>
         </w:numPr>
       </w:pPr>
-      <w:hyperlink r:id="rId102">
+      <w:hyperlink r:id="rId91">
         <w:r>
           <w:rPr>
             <w:rStyle w:val="Hyperlink"/>
@@ -2928,11 +2912,11 @@
     </w:p>
     <w:p>
       <w:pPr>
+        <w:pStyle w:val="Compact"/>
         <w:numPr>
           <w:ilvl w:val="1"/>
           <w:numId w:val="1035"/>
         </w:numPr>
-        <w:pStyle w:val="Compact"/>
       </w:pPr>
       <w:r>
         <w:t xml:space="preserve">Project co-lead for developing and extending common data model to represent biological ’omics data for reproducible queries and analyses.</w:t>
@@ -2940,11 +2924,11 @@
     </w:p>
     <w:p>
       <w:pPr>
+        <w:pStyle w:val="Compact"/>
         <w:numPr>
           <w:ilvl w:val="1"/>
           <w:numId w:val="1035"/>
         </w:numPr>
-        <w:pStyle w:val="Compact"/>
       </w:pPr>
       <w:r>
         <w:t xml:space="preserve">See original</w:t>
@@ -2952,7 +2936,7 @@
       <w:r>
         <w:t xml:space="preserve"> </w:t>
       </w:r>
-      <w:hyperlink r:id="rId103">
+      <w:hyperlink r:id="rId92">
         <w:r>
           <w:rPr>
             <w:rStyle w:val="Hyperlink"/>
@@ -2969,7 +2953,7 @@
       <w:r>
         <w:t xml:space="preserve"> </w:t>
       </w:r>
-      <w:hyperlink r:id="rId98">
+      <w:hyperlink r:id="rId87">
         <w:r>
           <w:rPr>
             <w:rStyle w:val="Hyperlink"/>
@@ -2991,7 +2975,7 @@
           <w:numId w:val="1029"/>
         </w:numPr>
       </w:pPr>
-      <w:hyperlink r:id="rId104">
+      <w:hyperlink r:id="rId93">
         <w:r>
           <w:rPr>
             <w:rStyle w:val="Hyperlink"/>
@@ -3007,7 +2991,7 @@
           <w:numId w:val="1029"/>
         </w:numPr>
       </w:pPr>
-      <w:hyperlink r:id="rId59">
+      <w:hyperlink r:id="rId48">
         <w:r>
           <w:rPr>
             <w:rStyle w:val="Hyperlink"/>
@@ -3023,7 +3007,7 @@
           <w:numId w:val="1029"/>
         </w:numPr>
       </w:pPr>
-      <w:hyperlink r:id="rId102">
+      <w:hyperlink r:id="rId91">
         <w:r>
           <w:rPr>
             <w:rStyle w:val="Hyperlink"/>
@@ -3034,11 +3018,11 @@
     </w:p>
     <w:p>
       <w:pPr>
+        <w:pStyle w:val="Compact"/>
         <w:numPr>
           <w:ilvl w:val="1"/>
           <w:numId w:val="1036"/>
         </w:numPr>
-        <w:pStyle w:val="Compact"/>
       </w:pPr>
       <w:r>
         <w:t xml:space="preserve">Project lead for developing data science notebooks and web application interfacing with drug safety data.</w:t>
@@ -3046,11 +3030,11 @@
     </w:p>
     <w:p>
       <w:pPr>
+        <w:pStyle w:val="Compact"/>
         <w:numPr>
           <w:ilvl w:val="1"/>
           <w:numId w:val="1036"/>
         </w:numPr>
-        <w:pStyle w:val="Compact"/>
       </w:pPr>
       <w:r>
         <w:t xml:space="preserve">See</w:t>
@@ -3058,7 +3042,7 @@
       <w:r>
         <w:t xml:space="preserve"> </w:t>
       </w:r>
-      <w:hyperlink r:id="rId105">
+      <w:hyperlink r:id="rId94">
         <w:r>
           <w:rPr>
             <w:rStyle w:val="Hyperlink"/>
@@ -3080,7 +3064,7 @@
           <w:numId w:val="1029"/>
         </w:numPr>
       </w:pPr>
-      <w:hyperlink r:id="rId106">
+      <w:hyperlink r:id="rId95">
         <w:r>
           <w:rPr>
             <w:rStyle w:val="Hyperlink"/>
@@ -3096,7 +3080,7 @@
           <w:numId w:val="1029"/>
         </w:numPr>
       </w:pPr>
-      <w:hyperlink r:id="rId107">
+      <w:hyperlink r:id="rId96">
         <w:r>
           <w:rPr>
             <w:rStyle w:val="Hyperlink"/>
@@ -3118,11 +3102,12 @@
       <w:r>
         <w:t xml:space="preserve"> </w:t>
       </w:r>
-      <w:hyperlink r:id="rId68">
+      <w:hyperlink r:id="rId57">
         <w:r>
           <w:rPr>
             <w:rStyle w:val="Hyperlink"/>
             <w:i/>
+            <w:iCs/>
           </w:rPr>
           <w:t xml:space="preserve">Giangreco et al. 2017</w:t>
         </w:r>
@@ -3138,7 +3123,7 @@
           <w:numId w:val="1029"/>
         </w:numPr>
       </w:pPr>
-      <w:hyperlink r:id="rId108">
+      <w:hyperlink r:id="rId97">
         <w:r>
           <w:rPr>
             <w:rStyle w:val="Hyperlink"/>
@@ -3154,7 +3139,7 @@
           <w:numId w:val="1029"/>
         </w:numPr>
       </w:pPr>
-      <w:hyperlink r:id="rId109">
+      <w:hyperlink r:id="rId98">
         <w:r>
           <w:rPr>
             <w:rStyle w:val="Hyperlink"/>
@@ -3181,7 +3166,7 @@
           <w:numId w:val="1029"/>
         </w:numPr>
       </w:pPr>
-      <w:hyperlink r:id="rId110">
+      <w:hyperlink r:id="rId99">
         <w:r>
           <w:rPr>
             <w:rStyle w:val="Hyperlink"/>
@@ -3206,6 +3191,7 @@
       <w:r>
         <w:rPr>
           <w:i/>
+          <w:iCs/>
         </w:rPr>
         <w:t xml:space="preserve">Giangreco et al. 2013</w:t>
       </w:r>
@@ -3213,8 +3199,8 @@
         <w:t xml:space="preserve">.</w:t>
       </w:r>
     </w:p>
-    <w:bookmarkEnd w:id="111"/>
-    <w:bookmarkStart w:id="120" w:name="talks-and-panels"/>
+    <w:bookmarkEnd w:id="100"/>
+    <w:bookmarkStart w:id="109" w:name="talks-and-panels"/>
     <w:p>
       <w:pPr>
         <w:pStyle w:val="Heading2"/>
@@ -3225,11 +3211,11 @@
     </w:p>
     <w:p>
       <w:pPr>
+        <w:pStyle w:val="Compact"/>
         <w:numPr>
           <w:ilvl w:val="0"/>
           <w:numId w:val="1037"/>
         </w:numPr>
-        <w:pStyle w:val="Compact"/>
       </w:pPr>
       <w:r>
         <w:t xml:space="preserve">Panelist for S14:</w:t>
@@ -3238,18 +3224,12 @@
         <w:t xml:space="preserve"> </w:t>
       </w:r>
       <w:r>
-        <w:t xml:space="preserve">“</w:t>
-      </w:r>
-      <w:r>
-        <w:t xml:space="preserve">Utility of the All of Us Researcher Workbench in Educational and Research Settings</w:t>
-      </w:r>
-      <w:r>
-        <w:t xml:space="preserve">”</w:t>
-      </w:r>
-      <w:r>
-        <w:t xml:space="preserve"> </w:t>
-      </w:r>
-      <w:hyperlink r:id="rId91">
+        <w:t xml:space="preserve">“Utility of the All of Us Researcher Workbench in Educational and Research Settings”</w:t>
+      </w:r>
+      <w:r>
+        <w:t xml:space="preserve"> </w:t>
+      </w:r>
+      <w:hyperlink r:id="rId80">
         <w:r>
           <w:rPr>
             <w:rStyle w:val="Hyperlink"/>
@@ -3266,11 +3246,11 @@
     </w:p>
     <w:p>
       <w:pPr>
+        <w:pStyle w:val="Compact"/>
         <w:numPr>
           <w:ilvl w:val="0"/>
           <w:numId w:val="1037"/>
         </w:numPr>
-        <w:pStyle w:val="Compact"/>
       </w:pPr>
       <w:r>
         <w:t xml:space="preserve">DBMI Justice Informatics Joint Forum. Internal, collaborative meeting discussing the impact of Big Data and mathematical models on inequity and how that applies to research.</w:t>
@@ -3278,17 +3258,14 @@
     </w:p>
     <w:p>
       <w:pPr>
+        <w:pStyle w:val="Compact"/>
         <w:numPr>
           <w:ilvl w:val="0"/>
           <w:numId w:val="1037"/>
         </w:numPr>
-        <w:pStyle w:val="Compact"/>
-      </w:pPr>
-      <w:r>
-        <w:t xml:space="preserve">“</w:t>
-      </w:r>
-      <w:r>
-        <w:t xml:space="preserve">Pediatrics data in</w:t>
+      </w:pPr>
+      <w:r>
+        <w:t xml:space="preserve">“Pediatrics data in</w:t>
       </w:r>
       <w:r>
         <w:t xml:space="preserve"> </w:t>
@@ -3296,6 +3273,7 @@
       <w:r>
         <w:rPr>
           <w:i/>
+          <w:iCs/>
         </w:rPr>
         <w:t xml:space="preserve">All of Us</w:t>
       </w:r>
@@ -3308,11 +3286,11 @@
     </w:p>
     <w:p>
       <w:pPr>
+        <w:pStyle w:val="Compact"/>
         <w:numPr>
           <w:ilvl w:val="0"/>
           <w:numId w:val="1037"/>
         </w:numPr>
-        <w:pStyle w:val="Compact"/>
       </w:pPr>
       <w:r>
         <w:t xml:space="preserve">2021 Graduate Scholar for research talk entitled</w:t>
@@ -3321,13 +3299,7 @@
         <w:t xml:space="preserve"> </w:t>
       </w:r>
       <w:r>
-        <w:t xml:space="preserve">‘</w:t>
-      </w:r>
-      <w:r>
-        <w:t xml:space="preserve">Mind the developmental gap: Identifying adverse drug effects across childhood to evaluate biological mechanisms from growth and development</w:t>
-      </w:r>
-      <w:r>
-        <w:t xml:space="preserve">’</w:t>
+        <w:t xml:space="preserve">‘Mind the developmental gap: Identifying adverse drug effects across childhood to evaluate biological mechanisms from growth and development’</w:t>
       </w:r>
       <w:r>
         <w:t xml:space="preserve"> </w:t>
@@ -3338,7 +3310,7 @@
       <w:r>
         <w:t xml:space="preserve"> </w:t>
       </w:r>
-      <w:hyperlink r:id="rId112">
+      <w:hyperlink r:id="rId101">
         <w:r>
           <w:rPr>
             <w:rStyle w:val="Hyperlink"/>
@@ -3349,20 +3321,14 @@
     </w:p>
     <w:p>
       <w:pPr>
+        <w:pStyle w:val="Compact"/>
         <w:numPr>
           <w:ilvl w:val="0"/>
           <w:numId w:val="1037"/>
         </w:numPr>
-        <w:pStyle w:val="Compact"/>
-      </w:pPr>
-      <w:r>
-        <w:t xml:space="preserve">“</w:t>
-      </w:r>
-      <w:r>
-        <w:t xml:space="preserve">Understanding dynamics with statistical modeling</w:t>
-      </w:r>
-      <w:r>
-        <w:t xml:space="preserve">”</w:t>
+      </w:pPr>
+      <w:r>
+        <w:t xml:space="preserve">“Understanding dynamics with statistical modeling”</w:t>
       </w:r>
       <w:r>
         <w:t xml:space="preserve"> </w:t>
@@ -3373,7 +3339,7 @@
       <w:r>
         <w:t xml:space="preserve"> </w:t>
       </w:r>
-      <w:hyperlink r:id="rId113">
+      <w:hyperlink r:id="rId102">
         <w:r>
           <w:rPr>
             <w:rStyle w:val="Hyperlink"/>
@@ -3384,20 +3350,14 @@
     </w:p>
     <w:p>
       <w:pPr>
+        <w:pStyle w:val="Compact"/>
         <w:numPr>
           <w:ilvl w:val="0"/>
           <w:numId w:val="1037"/>
         </w:numPr>
-        <w:pStyle w:val="Compact"/>
-      </w:pPr>
-      <w:r>
-        <w:t xml:space="preserve">“</w:t>
-      </w:r>
-      <w:r>
-        <w:t xml:space="preserve">Introduction to programming and bioinformatics</w:t>
-      </w:r>
-      <w:r>
-        <w:t xml:space="preserve">”</w:t>
+      </w:pPr>
+      <w:r>
+        <w:t xml:space="preserve">“Introduction to programming and bioinformatics”</w:t>
       </w:r>
       <w:r>
         <w:t xml:space="preserve"> </w:t>
@@ -3408,20 +3368,14 @@
     </w:p>
     <w:p>
       <w:pPr>
+        <w:pStyle w:val="Compact"/>
         <w:numPr>
           <w:ilvl w:val="0"/>
           <w:numId w:val="1037"/>
         </w:numPr>
-        <w:pStyle w:val="Compact"/>
-      </w:pPr>
-      <w:r>
-        <w:t xml:space="preserve">“</w:t>
-      </w:r>
-      <w:r>
-        <w:t xml:space="preserve">Intro to Bioinformatics and How to Analyze Brain Tissue with Data Science</w:t>
-      </w:r>
-      <w:r>
-        <w:t xml:space="preserve">”</w:t>
+      </w:pPr>
+      <w:r>
+        <w:t xml:space="preserve">“Intro to Bioinformatics and How to Analyze Brain Tissue with Data Science”</w:t>
       </w:r>
       <w:r>
         <w:t xml:space="preserve">. Invited presentation at</w:t>
@@ -3429,7 +3383,7 @@
       <w:r>
         <w:t xml:space="preserve"> </w:t>
       </w:r>
-      <w:hyperlink r:id="rId114">
+      <w:hyperlink r:id="rId103">
         <w:r>
           <w:rPr>
             <w:rStyle w:val="Hyperlink"/>
@@ -3443,7 +3397,7 @@
       <w:r>
         <w:t xml:space="preserve"> </w:t>
       </w:r>
-      <w:hyperlink r:id="rId115">
+      <w:hyperlink r:id="rId104">
         <w:r>
           <w:rPr>
             <w:rStyle w:val="Hyperlink"/>
@@ -3457,11 +3411,11 @@
     </w:p>
     <w:p>
       <w:pPr>
+        <w:pStyle w:val="Compact"/>
         <w:numPr>
           <w:ilvl w:val="0"/>
           <w:numId w:val="1037"/>
         </w:numPr>
-        <w:pStyle w:val="Compact"/>
       </w:pPr>
       <w:r>
         <w:t xml:space="preserve">Medical Research Career Panelist, Minds Matter NYC, June 2018</w:t>
@@ -3469,11 +3423,11 @@
     </w:p>
     <w:p>
       <w:pPr>
+        <w:pStyle w:val="Compact"/>
         <w:numPr>
           <w:ilvl w:val="0"/>
           <w:numId w:val="1037"/>
         </w:numPr>
-        <w:pStyle w:val="Compact"/>
       </w:pPr>
       <w:r>
         <w:t xml:space="preserve">Standardized and Reproducible Analysis Enables Identification of Novel Primary Graft Dysfunction Biomarkers using Exosome Proteomics,</w:t>
@@ -3481,7 +3435,7 @@
       <w:r>
         <w:t xml:space="preserve"> </w:t>
       </w:r>
-      <w:hyperlink r:id="rId116">
+      <w:hyperlink r:id="rId105">
         <w:r>
           <w:rPr>
             <w:rStyle w:val="Hyperlink"/>
@@ -3495,30 +3449,18 @@
     </w:p>
     <w:p>
       <w:pPr>
+        <w:pStyle w:val="Compact"/>
         <w:numPr>
           <w:ilvl w:val="0"/>
           <w:numId w:val="1037"/>
         </w:numPr>
-        <w:pStyle w:val="Compact"/>
-      </w:pPr>
-      <w:hyperlink r:id="rId117">
-        <w:r>
-          <w:rPr>
-            <w:rStyle w:val="Hyperlink"/>
-          </w:rPr>
-          <w:t xml:space="preserve">“</w:t>
-        </w:r>
-        <w:r>
-          <w:rPr>
-            <w:rStyle w:val="Hyperlink"/>
-          </w:rPr>
-          <w:t xml:space="preserve">Tools, Libraries and Analyses in Biomedical Data Science</w:t>
-        </w:r>
-        <w:r>
-          <w:rPr>
-            <w:rStyle w:val="Hyperlink"/>
-          </w:rPr>
-          <w:t xml:space="preserve">”</w:t>
+      </w:pPr>
+      <w:hyperlink r:id="rId106">
+        <w:r>
+          <w:rPr>
+            <w:rStyle w:val="Hyperlink"/>
+          </w:rPr>
+          <w:t xml:space="preserve">“Tools, Libraries and Analyses in Biomedical Data Science”</w:t>
         </w:r>
       </w:hyperlink>
       <w:r>
@@ -3527,30 +3469,18 @@
     </w:p>
     <w:p>
       <w:pPr>
+        <w:pStyle w:val="Compact"/>
         <w:numPr>
           <w:ilvl w:val="0"/>
           <w:numId w:val="1037"/>
         </w:numPr>
-        <w:pStyle w:val="Compact"/>
-      </w:pPr>
-      <w:hyperlink r:id="rId118">
-        <w:r>
-          <w:rPr>
-            <w:rStyle w:val="Hyperlink"/>
-          </w:rPr>
-          <w:t xml:space="preserve">“</w:t>
-        </w:r>
-        <w:r>
-          <w:rPr>
-            <w:rStyle w:val="Hyperlink"/>
-          </w:rPr>
-          <w:t xml:space="preserve">Doing Science with Big Data</w:t>
-        </w:r>
-        <w:r>
-          <w:rPr>
-            <w:rStyle w:val="Hyperlink"/>
-          </w:rPr>
-          <w:t xml:space="preserve">”</w:t>
+      </w:pPr>
+      <w:hyperlink r:id="rId107">
+        <w:r>
+          <w:rPr>
+            <w:rStyle w:val="Hyperlink"/>
+          </w:rPr>
+          <w:t xml:space="preserve">“Doing Science with Big Data”</w:t>
         </w:r>
       </w:hyperlink>
       <w:r>
@@ -3559,20 +3489,14 @@
     </w:p>
     <w:p>
       <w:pPr>
+        <w:pStyle w:val="Compact"/>
         <w:numPr>
           <w:ilvl w:val="0"/>
           <w:numId w:val="1037"/>
         </w:numPr>
-        <w:pStyle w:val="Compact"/>
-      </w:pPr>
-      <w:r>
-        <w:t xml:space="preserve">“</w:t>
-      </w:r>
-      <w:r>
-        <w:t xml:space="preserve">AI, Life Sciences, and Big Data</w:t>
-      </w:r>
-      <w:r>
-        <w:t xml:space="preserve">”</w:t>
+      </w:pPr>
+      <w:r>
+        <w:t xml:space="preserve">“AI, Life Sciences, and Big Data”</w:t>
       </w:r>
       <w:r>
         <w:t xml:space="preserve">, New York Healthcare Artificial Intelligence Society, August 2017.</w:t>
@@ -3580,7 +3504,7 @@
       <w:r>
         <w:t xml:space="preserve"> </w:t>
       </w:r>
-      <w:hyperlink r:id="rId119">
+      <w:hyperlink r:id="rId108">
         <w:r>
           <w:rPr>
             <w:rStyle w:val="Hyperlink"/>
@@ -3594,18 +3518,18 @@
     </w:p>
     <w:p>
       <w:pPr>
+        <w:pStyle w:val="Compact"/>
         <w:numPr>
           <w:ilvl w:val="0"/>
           <w:numId w:val="1037"/>
         </w:numPr>
-        <w:pStyle w:val="Compact"/>
       </w:pPr>
       <w:r>
         <w:t xml:space="preserve">NIDDK Undergraduate Step-Up Judge, NIH, Bethesda MD, August 2015.</w:t>
       </w:r>
     </w:p>
-    <w:bookmarkEnd w:id="120"/>
-    <w:bookmarkStart w:id="121" w:name="professional-memberships"/>
+    <w:bookmarkEnd w:id="109"/>
+    <w:bookmarkStart w:id="110" w:name="professional-memberships"/>
     <w:p>
       <w:pPr>
         <w:pStyle w:val="Heading2"/>
@@ -3616,11 +3540,11 @@
     </w:p>
     <w:p>
       <w:pPr>
+        <w:pStyle w:val="Compact"/>
         <w:numPr>
           <w:ilvl w:val="0"/>
           <w:numId w:val="1038"/>
         </w:numPr>
-        <w:pStyle w:val="Compact"/>
       </w:pPr>
       <w:r>
         <w:t xml:space="preserve">International Society of Computational Biology, 2013-2014 &amp; 2017-2018</w:t>
@@ -3628,11 +3552,11 @@
     </w:p>
     <w:p>
       <w:pPr>
+        <w:pStyle w:val="Compact"/>
         <w:numPr>
           <w:ilvl w:val="0"/>
           <w:numId w:val="1038"/>
         </w:numPr>
-        <w:pStyle w:val="Compact"/>
       </w:pPr>
       <w:r>
         <w:t xml:space="preserve">American Heart Association, 2017-2018.</w:t>
@@ -3640,18 +3564,22 @@
     </w:p>
     <w:p>
       <w:pPr>
+        <w:pStyle w:val="Compact"/>
         <w:numPr>
           <w:ilvl w:val="0"/>
           <w:numId w:val="1038"/>
         </w:numPr>
-        <w:pStyle w:val="Compact"/>
       </w:pPr>
       <w:r>
         <w:t xml:space="preserve">American Medical Informatics Association, 2017-2018.</w:t>
       </w:r>
     </w:p>
-    <w:bookmarkEnd w:id="121"/>
-    <w:sectPr/>
+    <w:bookmarkEnd w:id="110"/>
+    <w:sectPr>
+      <w:footnotePr>
+        <w:numRestart w:val="eachSect"/>
+      </w:footnotePr>
+    </w:sectPr>
   </w:body>
 </w:document>
 </file>
@@ -3682,17 +3610,14 @@
 <file path=word/numbering.xml><?xml version="1.0" encoding="utf-8"?>
 <w:numbering xmlns:w="http://schemas.openxmlformats.org/wordprocessingml/2006/main">
   <w:abstractNum w:abstractNumId="990">
-    <w:nsid w:val="2c1ae401"/>
+    <w:nsid w:val="0000A990"/>
     <w:multiLevelType w:val="multilevel"/>
     <w:lvl w:ilvl="0">
       <w:numFmt w:val="bullet"/>
       <w:lvlText w:val=" "/>
       <w:lvlJc w:val="left"/>
       <w:pPr>
-        <w:tabs>
-          <w:tab w:val="num" w:pos="0"/>
-        </w:tabs>
-        <w:ind w:left="480" w:hanging="480"/>
+        <w:ind w:left="720" w:hanging="360"/>
       </w:pPr>
     </w:lvl>
     <w:lvl w:ilvl="1">
@@ -3700,10 +3625,7 @@
       <w:lvlText w:val=" "/>
       <w:lvlJc w:val="left"/>
       <w:pPr>
-        <w:tabs>
-          <w:tab w:val="num" w:pos="720"/>
-        </w:tabs>
-        <w:ind w:left="1200" w:hanging="480"/>
+        <w:ind w:left="1440" w:hanging="360"/>
       </w:pPr>
     </w:lvl>
     <w:lvl w:ilvl="2">
@@ -3711,10 +3633,7 @@
       <w:lvlText w:val=" "/>
       <w:lvlJc w:val="left"/>
       <w:pPr>
-        <w:tabs>
-          <w:tab w:val="num" w:pos="1440"/>
-        </w:tabs>
-        <w:ind w:left="1920" w:hanging="480"/>
+        <w:ind w:left="2160" w:hanging="360"/>
       </w:pPr>
     </w:lvl>
     <w:lvl w:ilvl="3">
@@ -3722,10 +3641,7 @@
       <w:lvlText w:val=" "/>
       <w:lvlJc w:val="left"/>
       <w:pPr>
-        <w:tabs>
-          <w:tab w:val="num" w:pos="2160"/>
-        </w:tabs>
-        <w:ind w:left="2640" w:hanging="480"/>
+        <w:ind w:left="2880" w:hanging="360"/>
       </w:pPr>
     </w:lvl>
     <w:lvl w:ilvl="4">
@@ -3733,10 +3649,7 @@
       <w:lvlText w:val=" "/>
       <w:lvlJc w:val="left"/>
       <w:pPr>
-        <w:tabs>
-          <w:tab w:val="num" w:pos="2880"/>
-        </w:tabs>
-        <w:ind w:left="3360" w:hanging="480"/>
+        <w:ind w:left="3600" w:hanging="360"/>
       </w:pPr>
     </w:lvl>
     <w:lvl w:ilvl="5">
@@ -3744,10 +3657,7 @@
       <w:lvlText w:val=" "/>
       <w:lvlJc w:val="left"/>
       <w:pPr>
-        <w:tabs>
-          <w:tab w:val="num" w:pos="3600"/>
-        </w:tabs>
-        <w:ind w:left="4080" w:hanging="480"/>
+        <w:ind w:left="4320" w:hanging="360"/>
       </w:pPr>
     </w:lvl>
     <w:lvl w:ilvl="6">
@@ -3755,10 +3665,7 @@
       <w:lvlText w:val=" "/>
       <w:lvlJc w:val="left"/>
       <w:pPr>
-        <w:tabs>
-          <w:tab w:val="num" w:pos="4320"/>
-        </w:tabs>
-        <w:ind w:left="4800" w:hanging="480"/>
+        <w:ind w:left="5040" w:hanging="360"/>
       </w:pPr>
     </w:lvl>
     <w:lvl w:ilvl="7">
@@ -3766,10 +3673,7 @@
       <w:lvlText w:val=" "/>
       <w:lvlJc w:val="left"/>
       <w:pPr>
-        <w:tabs>
-          <w:tab w:val="num" w:pos="5040"/>
-        </w:tabs>
-        <w:ind w:left="5520" w:hanging="480"/>
+        <w:ind w:left="5760" w:hanging="360"/>
       </w:pPr>
     </w:lvl>
     <w:lvl w:ilvl="8">
@@ -3777,118 +3681,115 @@
       <w:lvlText w:val=" "/>
       <w:lvlJc w:val="left"/>
       <w:pPr>
-        <w:tabs>
-          <w:tab w:val="num" w:pos="5760"/>
-        </w:tabs>
-        <w:ind w:left="6240" w:hanging="480"/>
+        <w:ind w:left="6480" w:hanging="360"/>
       </w:pPr>
     </w:lvl>
   </w:abstractNum>
   <w:abstractNum w:abstractNumId="991">
-    <w:nsid w:val="ea454b4c"/>
+    <w:nsid w:val="0000A991"/>
     <w:multiLevelType w:val="multilevel"/>
     <w:lvl w:ilvl="0">
       <w:numFmt w:val="bullet"/>
-      <w:lvlText w:val="•"/>
+      <w:lvlText w:val=""/>
       <w:lvlJc w:val="left"/>
       <w:pPr>
-        <w:tabs>
-          <w:tab w:val="num" w:pos="0"/>
-        </w:tabs>
-        <w:ind w:left="480" w:hanging="480"/>
-      </w:pPr>
+        <w:ind w:left="720" w:hanging="360"/>
+      </w:pPr>
+      <w:rPr>
+        <w:rFonts w:ascii="Symbol" w:hAnsi="Symbol" w:cs="Symbol" w:hint="default"/>
+      </w:rPr>
     </w:lvl>
     <w:lvl w:ilvl="1">
       <w:numFmt w:val="bullet"/>
-      <w:lvlText w:val="–"/>
+      <w:lvlText w:val="o"/>
       <w:lvlJc w:val="left"/>
       <w:pPr>
-        <w:tabs>
-          <w:tab w:val="num" w:pos="720"/>
-        </w:tabs>
-        <w:ind w:left="1200" w:hanging="480"/>
-      </w:pPr>
+        <w:ind w:left="1440" w:hanging="360"/>
+      </w:pPr>
+      <w:rPr>
+        <w:rFonts w:ascii="Courier New" w:hAnsi="Courier New" w:cs="Courier New" w:hint="default"/>
+      </w:rPr>
     </w:lvl>
     <w:lvl w:ilvl="2">
       <w:numFmt w:val="bullet"/>
-      <w:lvlText w:val="•"/>
+      <w:lvlText w:val=""/>
       <w:lvlJc w:val="left"/>
       <w:pPr>
-        <w:tabs>
-          <w:tab w:val="num" w:pos="1440"/>
-        </w:tabs>
-        <w:ind w:left="1920" w:hanging="480"/>
-      </w:pPr>
+        <w:ind w:left="2160" w:hanging="360"/>
+      </w:pPr>
+      <w:rPr>
+        <w:rFonts w:ascii="Wingdings" w:hAnsi="Wingdings" w:cs="Wingdings" w:hint="default"/>
+      </w:rPr>
     </w:lvl>
     <w:lvl w:ilvl="3">
       <w:numFmt w:val="bullet"/>
-      <w:lvlText w:val="–"/>
+      <w:lvlText w:val=""/>
       <w:lvlJc w:val="left"/>
       <w:pPr>
-        <w:tabs>
-          <w:tab w:val="num" w:pos="2160"/>
-        </w:tabs>
-        <w:ind w:left="2640" w:hanging="480"/>
-      </w:pPr>
+        <w:ind w:left="2880" w:hanging="360"/>
+      </w:pPr>
+      <w:rPr>
+        <w:rFonts w:ascii="Symbol" w:hAnsi="Symbol" w:cs="Symbol" w:hint="default"/>
+      </w:rPr>
     </w:lvl>
     <w:lvl w:ilvl="4">
       <w:numFmt w:val="bullet"/>
-      <w:lvlText w:val="•"/>
+      <w:lvlText w:val="o"/>
       <w:lvlJc w:val="left"/>
       <w:pPr>
-        <w:tabs>
-          <w:tab w:val="num" w:pos="2880"/>
-        </w:tabs>
-        <w:ind w:left="3360" w:hanging="480"/>
-      </w:pPr>
+        <w:ind w:left="3600" w:hanging="360"/>
+      </w:pPr>
+      <w:rPr>
+        <w:rFonts w:ascii="Courier New" w:hAnsi="Courier New" w:cs="Courier New" w:hint="default"/>
+      </w:rPr>
     </w:lvl>
     <w:lvl w:ilvl="5">
       <w:numFmt w:val="bullet"/>
-      <w:lvlText w:val="–"/>
+      <w:lvlText w:val=""/>
       <w:lvlJc w:val="left"/>
       <w:pPr>
-        <w:tabs>
-          <w:tab w:val="num" w:pos="3600"/>
-        </w:tabs>
-        <w:ind w:left="4080" w:hanging="480"/>
-      </w:pPr>
+        <w:ind w:left="4320" w:hanging="360"/>
+      </w:pPr>
+      <w:rPr>
+        <w:rFonts w:ascii="Wingdings" w:hAnsi="Wingdings" w:cs="Wingdings" w:hint="default"/>
+      </w:rPr>
     </w:lvl>
     <w:lvl w:ilvl="6">
       <w:numFmt w:val="bullet"/>
-      <w:lvlText w:val="•"/>
+      <w:lvlText w:val=""/>
       <w:lvlJc w:val="left"/>
       <w:pPr>
-        <w:tabs>
-          <w:tab w:val="num" w:pos="4320"/>
-        </w:tabs>
-        <w:ind w:left="4800" w:hanging="480"/>
-      </w:pPr>
+        <w:ind w:left="5040" w:hanging="360"/>
+      </w:pPr>
+      <w:rPr>
+        <w:rFonts w:ascii="Symbol" w:hAnsi="Symbol" w:cs="Symbol" w:hint="default"/>
+      </w:rPr>
     </w:lvl>
     <w:lvl w:ilvl="7">
       <w:numFmt w:val="bullet"/>
-      <w:lvlText w:val="–"/>
+      <w:lvlText w:val="o"/>
       <w:lvlJc w:val="left"/>
       <w:pPr>
-        <w:tabs>
-          <w:tab w:val="num" w:pos="5040"/>
-        </w:tabs>
-        <w:ind w:left="5520" w:hanging="480"/>
-      </w:pPr>
+        <w:ind w:left="5760" w:hanging="360"/>
+      </w:pPr>
+      <w:rPr>
+        <w:rFonts w:ascii="Courier New" w:hAnsi="Courier New" w:cs="Courier New" w:hint="default"/>
+      </w:rPr>
     </w:lvl>
     <w:lvl w:ilvl="8">
       <w:numFmt w:val="bullet"/>
-      <w:lvlText w:val="•"/>
+      <w:lvlText w:val=""/>
       <w:lvlJc w:val="left"/>
       <w:pPr>
-        <w:tabs>
-          <w:tab w:val="num" w:pos="5760"/>
-        </w:tabs>
-        <w:ind w:left="6240" w:hanging="480"/>
-      </w:pPr>
+        <w:ind w:left="6480" w:hanging="360"/>
+      </w:pPr>
+      <w:rPr>
+        <w:rFonts w:ascii="Wingdings" w:hAnsi="Wingdings" w:cs="Wingdings" w:hint="default"/>
+      </w:rPr>
     </w:lvl>
   </w:abstractNum>
   <w:abstractNum w:abstractNumId="99411">
-    <w:nsid w:val="71315dca"/>
+    <w:nsid w:val="00A99411"/>
     <w:multiLevelType w:val="multilevel"/>
     <w:lvl w:ilvl="0">
       <w:start w:val="1"/>
@@ -3896,10 +3797,7 @@
       <w:lvlText w:val="%1."/>
       <w:lvlJc w:val="left"/>
       <w:pPr>
-        <w:tabs>
-          <w:tab w:val="num" w:pos="0"/>
-        </w:tabs>
-        <w:ind w:left="480" w:hanging="480"/>
+        <w:ind w:left="720" w:hanging="360"/>
       </w:pPr>
     </w:lvl>
     <w:lvl w:ilvl="1">
@@ -3908,10 +3806,7 @@
       <w:lvlText w:val="%2."/>
       <w:lvlJc w:val="left"/>
       <w:pPr>
-        <w:tabs>
-          <w:tab w:val="num" w:pos="720"/>
-        </w:tabs>
-        <w:ind w:left="1200" w:hanging="480"/>
+        <w:ind w:left="1440" w:hanging="360"/>
       </w:pPr>
     </w:lvl>
     <w:lvl w:ilvl="2">
@@ -3920,10 +3815,7 @@
       <w:lvlText w:val="%3."/>
       <w:lvlJc w:val="left"/>
       <w:pPr>
-        <w:tabs>
-          <w:tab w:val="num" w:pos="1440"/>
-        </w:tabs>
-        <w:ind w:left="1920" w:hanging="480"/>
+        <w:ind w:left="2160" w:hanging="360"/>
       </w:pPr>
     </w:lvl>
     <w:lvl w:ilvl="3">
@@ -3932,10 +3824,7 @@
       <w:lvlText w:val="%4."/>
       <w:lvlJc w:val="left"/>
       <w:pPr>
-        <w:tabs>
-          <w:tab w:val="num" w:pos="2160"/>
-        </w:tabs>
-        <w:ind w:left="2640" w:hanging="480"/>
+        <w:ind w:left="2880" w:hanging="360"/>
       </w:pPr>
     </w:lvl>
     <w:lvl w:ilvl="4">
@@ -3944,10 +3833,7 @@
       <w:lvlText w:val="%5."/>
       <w:lvlJc w:val="left"/>
       <w:pPr>
-        <w:tabs>
-          <w:tab w:val="num" w:pos="2880"/>
-        </w:tabs>
-        <w:ind w:left="3360" w:hanging="480"/>
+        <w:ind w:left="3600" w:hanging="360"/>
       </w:pPr>
     </w:lvl>
     <w:lvl w:ilvl="5">
@@ -3956,10 +3842,7 @@
       <w:lvlText w:val="%6."/>
       <w:lvlJc w:val="left"/>
       <w:pPr>
-        <w:tabs>
-          <w:tab w:val="num" w:pos="3600"/>
-        </w:tabs>
-        <w:ind w:left="4080" w:hanging="480"/>
+        <w:ind w:left="4320" w:hanging="360"/>
       </w:pPr>
     </w:lvl>
     <w:lvl w:ilvl="6">
@@ -3968,10 +3851,7 @@
       <w:lvlText w:val="%7."/>
       <w:lvlJc w:val="left"/>
       <w:pPr>
-        <w:tabs>
-          <w:tab w:val="num" w:pos="4320"/>
-        </w:tabs>
-        <w:ind w:left="4800" w:hanging="480"/>
+        <w:ind w:left="5040" w:hanging="360"/>
       </w:pPr>
     </w:lvl>
     <w:lvl w:ilvl="7">
@@ -3980,10 +3860,7 @@
       <w:lvlText w:val="%8."/>
       <w:lvlJc w:val="left"/>
       <w:pPr>
-        <w:tabs>
-          <w:tab w:val="num" w:pos="5040"/>
-        </w:tabs>
-        <w:ind w:left="5520" w:hanging="480"/>
+        <w:ind w:left="5760" w:hanging="360"/>
       </w:pPr>
     </w:lvl>
     <w:lvl w:ilvl="8">
@@ -3992,10 +3869,7 @@
       <w:lvlText w:val="%9."/>
       <w:lvlJc w:val="left"/>
       <w:pPr>
-        <w:tabs>
-          <w:tab w:val="num" w:pos="5760"/>
-        </w:tabs>
-        <w:ind w:left="6240" w:hanging="480"/>
+        <w:ind w:left="6480" w:hanging="360"/>
       </w:pPr>
     </w:lvl>
   </w:abstractNum>
@@ -4151,10 +4025,10 @@
   <w:docDefaults>
     <w:rPrDefault>
       <w:rPr>
-        <w:rFonts w:asciiTheme="minorHAnsi" w:eastAsiaTheme="minorHAnsi" w:hAnsiTheme="minorHAnsi" w:cstheme="minorBidi"/>
+        <w:rFonts w:asciiTheme="minorHAnsi" w:cstheme="minorBidi" w:eastAsiaTheme="minorEastAsia" w:hAnsiTheme="minorHAnsi"/>
         <w:sz w:val="24"/>
         <w:szCs w:val="24"/>
-        <w:lang w:val="en-US" w:eastAsia="en-US" w:bidi="ar-SA"/>
+        <w:lang w:bidi="ar-SA" w:eastAsia="zh-CN" w:val="en-US"/>
       </w:rPr>
     </w:rPrDefault>
     <w:pPrDefault>
@@ -4163,91 +4037,145 @@
       </w:pPr>
     </w:pPrDefault>
   </w:docDefaults>
-  <w:latentStyles w:defLockedState="0" w:defUIPriority="0" w:defSemiHidden="0" w:defUnhideWhenUsed="0" w:defQFormat="0" w:count="276"/>
-  <w:style w:type="paragraph" w:default="1" w:styleId="Normal">
+  <w:latentStyles w:count="276" w:defLockedState="0" w:defQFormat="0" w:defSemiHidden="0" w:defUIPriority="0" w:defUnhideWhenUsed="0"/>
+  <w:style w:default="1" w:styleId="Normal" w:type="paragraph">
     <w:name w:val="Normal"/>
     <w:qFormat/>
   </w:style>
-  <w:style w:type="paragraph" w:styleId="BodyText">
+  <w:style w:styleId="BodyText" w:type="paragraph">
     <w:name w:val="Body Text"/>
     <w:basedOn w:val="Normal"/>
     <w:link w:val="BodyTextChar"/>
+    <w:qFormat/>
     <w:pPr>
-      <w:spacing w:before="180" w:after="180"/>
+      <w:spacing w:after="180" w:before="180"/>
     </w:pPr>
-    <w:qFormat/>
-  </w:style>
-  <w:style w:type="paragraph" w:customStyle="1" w:styleId="FirstParagraph">
+  </w:style>
+  <w:style w:customStyle="1" w:styleId="FirstParagraph" w:type="paragraph">
     <w:name w:val="First Paragraph"/>
     <w:basedOn w:val="BodyText"/>
     <w:next w:val="BodyText"/>
     <w:qFormat/>
   </w:style>
-  <w:style w:type="paragraph" w:customStyle="1" w:styleId="Compact">
+  <w:style w:customStyle="1" w:styleId="Compact" w:type="paragraph">
     <w:name w:val="Compact"/>
     <w:basedOn w:val="BodyText"/>
     <w:qFormat/>
     <w:pPr>
-      <w:spacing w:before="36" w:after="36"/>
+      <w:spacing w:after="36" w:before="36"/>
     </w:pPr>
   </w:style>
-  <w:style w:type="paragraph" w:styleId="Title">
+  <w:style w:styleId="Title" w:type="paragraph">
     <w:name w:val="Title"/>
     <w:basedOn w:val="Normal"/>
     <w:next w:val="BodyText"/>
+    <w:link w:val="TitleChar"/>
+    <w:uiPriority w:val="10"/>
     <w:qFormat/>
+    <w:rsid w:val="00A10FD9"/>
     <w:pPr>
-      <w:keepNext/>
-      <w:keepLines/>
-      <w:spacing w:before="480" w:after="240"/>
+      <w:spacing w:after="80" w:line="240" w:lineRule="auto"/>
+      <w:contextualSpacing/>
       <w:jc w:val="center"/>
     </w:pPr>
     <w:rPr>
-      <w:rFonts w:asciiTheme="majorHAnsi" w:eastAsiaTheme="majorEastAsia" w:hAnsiTheme="majorHAnsi" w:cstheme="majorBidi"/>
-      <w:b/>
-      <w:bCs/>
-      <w:color w:val="345A8A" w:themeColor="accent1" w:themeShade="B5"/>
-      <w:sz w:val="36"/>
-      <w:szCs w:val="36"/>
-    </w:rPr>
-  </w:style>
-  <w:style w:type="paragraph" w:styleId="Subtitle">
+      <w:rFonts w:asciiTheme="majorHAnsi" w:cstheme="majorBidi" w:eastAsiaTheme="majorEastAsia" w:hAnsiTheme="majorHAnsi"/>
+      <w:sz w:val="56"/>
+      <w:szCs w:val="56"/>
+    </w:rPr>
+  </w:style>
+  <w:style w:customStyle="1" w:styleId="TitleChar" w:type="character">
+    <w:name w:val="Title Char"/>
+    <w:basedOn w:val="DefaultParagraphFont"/>
+    <w:link w:val="Title"/>
+    <w:uiPriority w:val="10"/>
+    <w:rsid w:val="00A10FD9"/>
+    <w:rPr>
+      <w:rFonts w:asciiTheme="majorHAnsi" w:cstheme="majorBidi" w:eastAsiaTheme="majorEastAsia" w:hAnsiTheme="majorHAnsi"/>
+      <w:sz w:val="56"/>
+      <w:szCs w:val="56"/>
+    </w:rPr>
+  </w:style>
+  <w:style w:styleId="Subtitle" w:type="paragraph">
     <w:name w:val="Subtitle"/>
+    <w:basedOn w:val="Title"/>
+    <w:next w:val="BodyText"/>
+    <w:link w:val="SubtitleChar"/>
+    <w:uiPriority w:val="11"/>
+    <w:qFormat/>
+    <w:rsid w:val="00A10FD9"/>
+    <w:pPr>
+      <w:numPr>
+        <w:ilvl w:val="1"/>
+      </w:numPr>
+    </w:pPr>
+    <w:rPr>
+      <w:rFonts w:cstheme="majorBidi" w:eastAsiaTheme="majorEastAsia"/>
+      <w:spacing w:val="15"/>
+      <w:sz w:val="28"/>
+      <w:szCs w:val="28"/>
+    </w:rPr>
+  </w:style>
+  <w:style w:customStyle="1" w:styleId="SubtitleChar" w:type="character">
+    <w:name w:val="Subtitle Char"/>
+    <w:basedOn w:val="DefaultParagraphFont"/>
+    <w:link w:val="Subtitle"/>
+    <w:uiPriority w:val="11"/>
+    <w:rsid w:val="00A10FD9"/>
+    <w:rPr>
+      <w:rFonts w:cstheme="majorBidi" w:eastAsiaTheme="majorEastAsia"/>
+      <w:color w:themeColor="text1" w:themeTint="A6" w:val="595959"/>
+      <w:spacing w:val="15"/>
+      <w:sz w:val="28"/>
+      <w:szCs w:val="28"/>
+    </w:rPr>
+  </w:style>
+  <w:style w:customStyle="1" w:styleId="Author" w:type="paragraph">
+    <w:name w:val="Author"/>
     <w:basedOn w:val="Title"/>
     <w:next w:val="BodyText"/>
     <w:qFormat/>
     <w:pPr>
       <w:keepNext/>
       <w:keepLines/>
-      <w:spacing w:before="240" w:after="240"/>
-      <w:jc w:val="center"/>
     </w:pPr>
     <w:rPr>
-      <w:sz w:val="30"/>
-      <w:szCs w:val="30"/>
-    </w:rPr>
-  </w:style>
-  <w:style w:type="paragraph" w:customStyle="1" w:styleId="Author">
-    <w:name w:val="Author"/>
+      <w:sz w:val="24"/>
+      <w:szCs w:val="24"/>
+    </w:rPr>
+  </w:style>
+  <w:style w:styleId="Date" w:type="paragraph">
+    <w:name w:val="Date"/>
+    <w:basedOn w:val="Title"/>
     <w:next w:val="BodyText"/>
     <w:qFormat/>
     <w:pPr>
       <w:keepNext/>
       <w:keepLines/>
-      <w:jc w:val="center"/>
     </w:pPr>
-  </w:style>
-  <w:style w:type="paragraph" w:styleId="Date">
-    <w:name w:val="Date"/>
-    <w:next w:val="BodyText"/>
+    <w:rPr>
+      <w:sz w:val="24"/>
+      <w:szCs w:val="24"/>
+    </w:rPr>
+  </w:style>
+  <w:style w:customStyle="1" w:styleId="AbstractTitle" w:type="paragraph">
+    <w:name w:val="Abstract Title"/>
+    <w:basedOn w:val="Normal"/>
+    <w:next w:val="Abstract"/>
     <w:qFormat/>
     <w:pPr>
       <w:keepNext/>
       <w:keepLines/>
+      <w:spacing w:after="0" w:before="300"/>
       <w:jc w:val="center"/>
     </w:pPr>
-  </w:style>
-  <w:style w:type="paragraph" w:customStyle="1" w:styleId="Abstract">
+    <w:rPr>
+      <w:b/>
+      <w:sz w:val="20"/>
+      <w:szCs w:val="20"/>
+    </w:rPr>
+  </w:style>
+  <w:style w:customStyle="1" w:styleId="Abstract" w:type="paragraph">
     <w:name w:val="Abstract"/>
     <w:basedOn w:val="Normal"/>
     <w:next w:val="BodyText"/>
@@ -4255,14 +4183,14 @@
     <w:pPr>
       <w:keepNext/>
       <w:keepLines/>
-      <w:spacing w:before="300" w:after="300"/>
+      <w:spacing w:after="300" w:before="100"/>
     </w:pPr>
     <w:rPr>
       <w:sz w:val="20"/>
       <w:szCs w:val="20"/>
     </w:rPr>
   </w:style>
-  <w:style w:type="paragraph" w:styleId="Bibliography">
+  <w:style w:styleId="Bibliography" w:type="paragraph">
     <w:name w:val="Bibliography"/>
     <w:basedOn w:val="Normal"/>
     <w:next w:val="Bibliography"/>
@@ -4270,195 +4198,325 @@
     <w:pPr/>
     <w:rPr/>
   </w:style>
-  <w:style w:type="paragraph" w:styleId="Heading1">
-    <w:name w:val="Heading 1"/>
+  <w:style w:styleId="Heading1" w:type="paragraph">
+    <w:name w:val="heading 1"/>
     <w:basedOn w:val="Normal"/>
     <w:next w:val="BodyText"/>
+    <w:link w:val="Heading1Char"/>
     <w:uiPriority w:val="9"/>
     <w:qFormat/>
+    <w:rsid w:val="00A10FD9"/>
     <w:pPr>
       <w:keepNext/>
       <w:keepLines/>
-      <w:spacing w:before="480" w:after="0"/>
+      <w:spacing w:after="80" w:before="360"/>
       <w:outlineLvl w:val="0"/>
     </w:pPr>
     <w:rPr>
-      <w:rFonts w:asciiTheme="majorHAnsi" w:eastAsiaTheme="majorEastAsia" w:hAnsiTheme="majorHAnsi" w:cstheme="majorBidi"/>
-      <w:b/>
-      <w:bCs/>
-      <w:color w:val="4F81BD" w:themeColor="accent1"/>
-      <w:sz w:val="32"/>
-      <w:szCs w:val="32"/>
-    </w:rPr>
-  </w:style>
-  <w:style w:type="paragraph" w:styleId="Heading2">
-    <w:name w:val="Heading 2"/>
+      <w:rFonts w:asciiTheme="majorHAnsi" w:cstheme="majorBidi" w:eastAsiaTheme="majorEastAsia" w:hAnsiTheme="majorHAnsi"/>
+      <w:color w:themeColor="accent1" w:themeShade="BF" w:val="0F4761"/>
+      <w:sz w:val="40"/>
+      <w:szCs w:val="40"/>
+    </w:rPr>
+  </w:style>
+  <w:style w:styleId="Heading2" w:type="paragraph">
+    <w:name w:val="heading 2"/>
     <w:basedOn w:val="Normal"/>
     <w:next w:val="BodyText"/>
+    <w:link w:val="Heading2Char"/>
     <w:uiPriority w:val="9"/>
+    <w:semiHidden/>
     <w:unhideWhenUsed/>
     <w:qFormat/>
+    <w:rsid w:val="00A10FD9"/>
     <w:pPr>
       <w:keepNext/>
       <w:keepLines/>
-      <w:spacing w:before="200" w:after="0"/>
+      <w:spacing w:after="80" w:before="160"/>
       <w:outlineLvl w:val="1"/>
     </w:pPr>
     <w:rPr>
-      <w:rFonts w:asciiTheme="majorHAnsi" w:eastAsiaTheme="majorEastAsia" w:hAnsiTheme="majorHAnsi" w:cstheme="majorBidi"/>
-      <w:b/>
-      <w:bCs/>
-      <w:color w:val="4F81BD" w:themeColor="accent1"/>
-      <w:sz w:val="28"/>
-      <w:szCs w:val="28"/>
-    </w:rPr>
-  </w:style>
-  <w:style w:type="paragraph" w:styleId="Heading3">
-    <w:name w:val="Heading 3"/>
+      <w:rFonts w:asciiTheme="majorHAnsi" w:cstheme="majorBidi" w:eastAsiaTheme="majorEastAsia" w:hAnsiTheme="majorHAnsi"/>
+      <w:color w:themeColor="accent1" w:themeShade="BF" w:val="0F4761"/>
+      <w:sz w:val="32"/>
+      <w:szCs w:val="32"/>
+    </w:rPr>
+  </w:style>
+  <w:style w:styleId="Heading3" w:type="paragraph">
+    <w:name w:val="heading 3"/>
     <w:basedOn w:val="Normal"/>
     <w:next w:val="BodyText"/>
+    <w:link w:val="Heading3Char"/>
     <w:uiPriority w:val="9"/>
+    <w:semiHidden/>
     <w:unhideWhenUsed/>
     <w:qFormat/>
+    <w:rsid w:val="00A10FD9"/>
     <w:pPr>
       <w:keepNext/>
       <w:keepLines/>
-      <w:spacing w:before="200" w:after="0"/>
+      <w:spacing w:after="80" w:before="160"/>
       <w:outlineLvl w:val="2"/>
     </w:pPr>
     <w:rPr>
-      <w:rFonts w:asciiTheme="majorHAnsi" w:eastAsiaTheme="majorEastAsia" w:hAnsiTheme="majorHAnsi" w:cstheme="majorBidi"/>
-      <w:b/>
-      <w:bCs/>
-      <w:color w:val="4F81BD" w:themeColor="accent1"/>
-      <w:sz w:val="24"/>
-      <w:szCs w:val="24"/>
-    </w:rPr>
-  </w:style>
-  <w:style w:type="paragraph" w:styleId="Heading4">
-    <w:name w:val="Heading 4"/>
+      <w:rFonts w:cstheme="majorBidi" w:eastAsiaTheme="majorEastAsia"/>
+      <w:color w:themeColor="accent1" w:themeShade="BF" w:val="0F4761"/>
+      <w:sz w:val="28"/>
+      <w:szCs w:val="28"/>
+    </w:rPr>
+  </w:style>
+  <w:style w:styleId="Heading4" w:type="paragraph">
+    <w:name w:val="heading 4"/>
     <w:basedOn w:val="Normal"/>
     <w:next w:val="BodyText"/>
+    <w:link w:val="Heading4Char"/>
     <w:uiPriority w:val="9"/>
+    <w:semiHidden/>
     <w:unhideWhenUsed/>
     <w:qFormat/>
+    <w:rsid w:val="00A10FD9"/>
     <w:pPr>
       <w:keepNext/>
       <w:keepLines/>
-      <w:spacing w:before="200" w:after="0"/>
+      <w:spacing w:after="40" w:before="80"/>
       <w:outlineLvl w:val="3"/>
     </w:pPr>
     <w:rPr>
-      <w:rFonts w:asciiTheme="majorHAnsi" w:eastAsiaTheme="majorEastAsia" w:hAnsiTheme="majorHAnsi" w:cstheme="majorBidi"/>
+      <w:rFonts w:cstheme="majorBidi" w:eastAsiaTheme="majorEastAsia"/>
       <w:i/>
-      <w:bCs/>
-      <w:color w:val="4F81BD" w:themeColor="accent1"/>
-      <w:sz w:val="24"/>
-      <w:szCs w:val="24"/>
-    </w:rPr>
-  </w:style>
-  <w:style w:type="paragraph" w:styleId="Heading5">
-    <w:name w:val="Heading 5"/>
+      <w:iCs/>
+      <w:color w:themeColor="accent1" w:themeShade="BF" w:val="0F4761"/>
+    </w:rPr>
+  </w:style>
+  <w:style w:styleId="Heading5" w:type="paragraph">
+    <w:name w:val="heading 5"/>
     <w:basedOn w:val="Normal"/>
     <w:next w:val="BodyText"/>
+    <w:link w:val="Heading5Char"/>
     <w:uiPriority w:val="9"/>
+    <w:semiHidden/>
     <w:unhideWhenUsed/>
     <w:qFormat/>
+    <w:rsid w:val="00A10FD9"/>
     <w:pPr>
       <w:keepNext/>
       <w:keepLines/>
-      <w:spacing w:before="200" w:after="0"/>
+      <w:spacing w:after="40" w:before="80"/>
       <w:outlineLvl w:val="4"/>
     </w:pPr>
     <w:rPr>
-      <w:rFonts w:asciiTheme="majorHAnsi" w:eastAsiaTheme="majorEastAsia" w:hAnsiTheme="majorHAnsi" w:cstheme="majorBidi"/>
-      <w:iCs/>
-      <w:color w:val="4F81BD" w:themeColor="accent1"/>
-      <w:sz w:val="24"/>
-      <w:szCs w:val="24"/>
-    </w:rPr>
-  </w:style>
-  <w:style w:type="paragraph" w:styleId="Heading6">
-    <w:name w:val="Heading 6"/>
+      <w:rFonts w:cstheme="majorBidi" w:eastAsiaTheme="majorEastAsia"/>
+      <w:color w:themeColor="accent1" w:themeShade="BF" w:val="0F4761"/>
+    </w:rPr>
+  </w:style>
+  <w:style w:styleId="Heading6" w:type="paragraph">
+    <w:name w:val="heading 6"/>
     <w:basedOn w:val="Normal"/>
     <w:next w:val="BodyText"/>
+    <w:link w:val="Heading6Char"/>
     <w:uiPriority w:val="9"/>
+    <w:semiHidden/>
     <w:unhideWhenUsed/>
     <w:qFormat/>
+    <w:rsid w:val="00A10FD9"/>
     <w:pPr>
       <w:keepNext/>
       <w:keepLines/>
-      <w:spacing w:before="200" w:after="0"/>
+      <w:spacing w:after="0" w:before="40"/>
       <w:outlineLvl w:val="5"/>
     </w:pPr>
     <w:rPr>
-      <w:rFonts w:asciiTheme="majorHAnsi" w:eastAsiaTheme="majorEastAsia" w:hAnsiTheme="majorHAnsi" w:cstheme="majorBidi"/>
-      <w:color w:val="4F81BD" w:themeColor="accent1"/>
-      <w:sz w:val="24"/>
-      <w:szCs w:val="24"/>
-    </w:rPr>
-  </w:style>
-  <w:style w:type="paragraph" w:styleId="Heading7">
-    <w:name w:val="Heading 7"/>
+      <w:rFonts w:cstheme="majorBidi" w:eastAsiaTheme="majorEastAsia"/>
+      <w:i/>
+      <w:iCs/>
+      <w:color w:themeColor="text1" w:themeTint="A6" w:val="595959"/>
+    </w:rPr>
+  </w:style>
+  <w:style w:styleId="Heading7" w:type="paragraph">
+    <w:name w:val="heading 7"/>
     <w:basedOn w:val="Normal"/>
     <w:next w:val="BodyText"/>
+    <w:link w:val="Heading7Char"/>
     <w:uiPriority w:val="9"/>
+    <w:semiHidden/>
     <w:unhideWhenUsed/>
     <w:qFormat/>
+    <w:rsid w:val="00A10FD9"/>
     <w:pPr>
       <w:keepNext/>
       <w:keepLines/>
-      <w:spacing w:before="200" w:after="0"/>
+      <w:spacing w:after="0" w:before="40"/>
       <w:outlineLvl w:val="6"/>
     </w:pPr>
     <w:rPr>
-      <w:rFonts w:asciiTheme="majorHAnsi" w:eastAsiaTheme="majorEastAsia" w:hAnsiTheme="majorHAnsi" w:cstheme="majorBidi"/>
-      <w:color w:val="4F81BD" w:themeColor="accent1"/>
-      <w:sz w:val="24"/>
-      <w:szCs w:val="24"/>
-    </w:rPr>
-  </w:style>
-  <w:style w:type="paragraph" w:styleId="Heading8">
-    <w:name w:val="Heading 8"/>
+      <w:rFonts w:cstheme="majorBidi" w:eastAsiaTheme="majorEastAsia"/>
+      <w:color w:themeColor="text1" w:themeTint="A6" w:val="595959"/>
+    </w:rPr>
+  </w:style>
+  <w:style w:styleId="Heading8" w:type="paragraph">
+    <w:name w:val="heading 8"/>
     <w:basedOn w:val="Normal"/>
     <w:next w:val="BodyText"/>
+    <w:link w:val="Heading8Char"/>
     <w:uiPriority w:val="9"/>
+    <w:semiHidden/>
     <w:unhideWhenUsed/>
     <w:qFormat/>
+    <w:rsid w:val="00A10FD9"/>
     <w:pPr>
       <w:keepNext/>
       <w:keepLines/>
-      <w:spacing w:before="200" w:after="0"/>
+      <w:spacing w:after="0"/>
       <w:outlineLvl w:val="7"/>
     </w:pPr>
     <w:rPr>
-      <w:rFonts w:asciiTheme="majorHAnsi" w:eastAsiaTheme="majorEastAsia" w:hAnsiTheme="majorHAnsi" w:cstheme="majorBidi"/>
-      <w:color w:val="4F81BD" w:themeColor="accent1"/>
-      <w:sz w:val="24"/>
-      <w:szCs w:val="24"/>
-    </w:rPr>
-  </w:style>
-  <w:style w:type="paragraph" w:styleId="Heading9">
-    <w:name w:val="Heading 9"/>
+      <w:rFonts w:cstheme="majorBidi" w:eastAsiaTheme="majorEastAsia"/>
+      <w:i/>
+      <w:iCs/>
+      <w:color w:themeColor="text1" w:themeTint="D8" w:val="272727"/>
+    </w:rPr>
+  </w:style>
+  <w:style w:styleId="Heading9" w:type="paragraph">
+    <w:name w:val="heading 9"/>
     <w:basedOn w:val="Normal"/>
     <w:next w:val="BodyText"/>
+    <w:link w:val="Heading9Char"/>
     <w:uiPriority w:val="9"/>
+    <w:semiHidden/>
     <w:unhideWhenUsed/>
     <w:qFormat/>
+    <w:rsid w:val="00A10FD9"/>
     <w:pPr>
       <w:keepNext/>
       <w:keepLines/>
-      <w:spacing w:before="200" w:after="0"/>
+      <w:spacing w:after="0"/>
       <w:outlineLvl w:val="8"/>
     </w:pPr>
     <w:rPr>
-      <w:rFonts w:asciiTheme="majorHAnsi" w:eastAsiaTheme="majorEastAsia" w:hAnsiTheme="majorHAnsi" w:cstheme="majorBidi"/>
-      <w:color w:val="4F81BD" w:themeColor="accent1"/>
-      <w:sz w:val="24"/>
-      <w:szCs w:val="24"/>
-    </w:rPr>
-  </w:style>
-  <w:style w:type="paragraph" w:styleId="BlockText">
+      <w:rFonts w:cstheme="majorBidi" w:eastAsiaTheme="majorEastAsia"/>
+      <w:color w:themeColor="text1" w:themeTint="D8" w:val="272727"/>
+    </w:rPr>
+  </w:style>
+  <w:style w:customStyle="1" w:styleId="Heading1Char" w:type="character">
+    <w:name w:val="Heading 1 Char"/>
+    <w:basedOn w:val="DefaultParagraphFont"/>
+    <w:link w:val="Heading1"/>
+    <w:uiPriority w:val="9"/>
+    <w:rsid w:val="00A10FD9"/>
+    <w:rPr>
+      <w:rFonts w:asciiTheme="majorHAnsi" w:cstheme="majorBidi" w:eastAsiaTheme="majorEastAsia" w:hAnsiTheme="majorHAnsi"/>
+      <w:color w:themeColor="accent1" w:themeShade="BF" w:val="0F4761"/>
+      <w:sz w:val="40"/>
+      <w:szCs w:val="40"/>
+    </w:rPr>
+  </w:style>
+  <w:style w:customStyle="1" w:styleId="Heading2Char" w:type="character">
+    <w:name w:val="Heading 2 Char"/>
+    <w:basedOn w:val="DefaultParagraphFont"/>
+    <w:link w:val="Heading2"/>
+    <w:uiPriority w:val="9"/>
+    <w:semiHidden/>
+    <w:rsid w:val="00A10FD9"/>
+    <w:rPr>
+      <w:rFonts w:asciiTheme="majorHAnsi" w:cstheme="majorBidi" w:eastAsiaTheme="majorEastAsia" w:hAnsiTheme="majorHAnsi"/>
+      <w:color w:themeColor="accent1" w:themeShade="BF" w:val="0F4761"/>
+      <w:sz w:val="32"/>
+      <w:szCs w:val="32"/>
+    </w:rPr>
+  </w:style>
+  <w:style w:customStyle="1" w:styleId="Heading3Char" w:type="character">
+    <w:name w:val="Heading 3 Char"/>
+    <w:basedOn w:val="DefaultParagraphFont"/>
+    <w:link w:val="Heading3"/>
+    <w:uiPriority w:val="9"/>
+    <w:semiHidden/>
+    <w:rsid w:val="00A10FD9"/>
+    <w:rPr>
+      <w:rFonts w:cstheme="majorBidi" w:eastAsiaTheme="majorEastAsia"/>
+      <w:color w:themeColor="accent1" w:themeShade="BF" w:val="0F4761"/>
+      <w:sz w:val="28"/>
+      <w:szCs w:val="28"/>
+    </w:rPr>
+  </w:style>
+  <w:style w:customStyle="1" w:styleId="Heading4Char" w:type="character">
+    <w:name w:val="Heading 4 Char"/>
+    <w:basedOn w:val="DefaultParagraphFont"/>
+    <w:link w:val="Heading4"/>
+    <w:uiPriority w:val="9"/>
+    <w:semiHidden/>
+    <w:rsid w:val="00A10FD9"/>
+    <w:rPr>
+      <w:rFonts w:cstheme="majorBidi" w:eastAsiaTheme="majorEastAsia"/>
+      <w:i/>
+      <w:iCs/>
+      <w:color w:themeColor="accent1" w:themeShade="BF" w:val="0F4761"/>
+    </w:rPr>
+  </w:style>
+  <w:style w:customStyle="1" w:styleId="Heading5Char" w:type="character">
+    <w:name w:val="Heading 5 Char"/>
+    <w:basedOn w:val="DefaultParagraphFont"/>
+    <w:link w:val="Heading5"/>
+    <w:uiPriority w:val="9"/>
+    <w:semiHidden/>
+    <w:rsid w:val="00A10FD9"/>
+    <w:rPr>
+      <w:rFonts w:cstheme="majorBidi" w:eastAsiaTheme="majorEastAsia"/>
+      <w:color w:themeColor="accent1" w:themeShade="BF" w:val="0F4761"/>
+    </w:rPr>
+  </w:style>
+  <w:style w:customStyle="1" w:styleId="Heading6Char" w:type="character">
+    <w:name w:val="Heading 6 Char"/>
+    <w:basedOn w:val="DefaultParagraphFont"/>
+    <w:link w:val="Heading6"/>
+    <w:uiPriority w:val="9"/>
+    <w:semiHidden/>
+    <w:rsid w:val="00A10FD9"/>
+    <w:rPr>
+      <w:rFonts w:cstheme="majorBidi" w:eastAsiaTheme="majorEastAsia"/>
+      <w:i/>
+      <w:iCs/>
+      <w:color w:themeColor="text1" w:themeTint="A6" w:val="595959"/>
+    </w:rPr>
+  </w:style>
+  <w:style w:customStyle="1" w:styleId="Heading7Char" w:type="character">
+    <w:name w:val="Heading 7 Char"/>
+    <w:basedOn w:val="DefaultParagraphFont"/>
+    <w:link w:val="Heading7"/>
+    <w:uiPriority w:val="9"/>
+    <w:semiHidden/>
+    <w:rsid w:val="00A10FD9"/>
+    <w:rPr>
+      <w:rFonts w:cstheme="majorBidi" w:eastAsiaTheme="majorEastAsia"/>
+      <w:color w:themeColor="text1" w:themeTint="A6" w:val="595959"/>
+    </w:rPr>
+  </w:style>
+  <w:style w:customStyle="1" w:styleId="Heading8Char" w:type="character">
+    <w:name w:val="Heading 8 Char"/>
+    <w:basedOn w:val="DefaultParagraphFont"/>
+    <w:link w:val="Heading8"/>
+    <w:uiPriority w:val="9"/>
+    <w:semiHidden/>
+    <w:rsid w:val="00A10FD9"/>
+    <w:rPr>
+      <w:rFonts w:cstheme="majorBidi" w:eastAsiaTheme="majorEastAsia"/>
+      <w:i/>
+      <w:iCs/>
+      <w:color w:themeColor="text1" w:themeTint="D8" w:val="272727"/>
+    </w:rPr>
+  </w:style>
+  <w:style w:customStyle="1" w:styleId="Heading9Char" w:type="character">
+    <w:name w:val="Heading 9 Char"/>
+    <w:basedOn w:val="DefaultParagraphFont"/>
+    <w:link w:val="Heading9"/>
+    <w:uiPriority w:val="9"/>
+    <w:semiHidden/>
+    <w:rsid w:val="00A10FD9"/>
+    <w:rPr>
+      <w:rFonts w:cstheme="majorBidi" w:eastAsiaTheme="majorEastAsia"/>
+      <w:color w:themeColor="text1" w:themeTint="D8" w:val="272727"/>
+    </w:rPr>
+  </w:style>
+  <w:style w:styleId="BlockText" w:type="paragraph">
     <w:name w:val="Block Text"/>
     <w:basedOn w:val="BodyText"/>
     <w:next w:val="BodyText"/>
@@ -4466,11 +4524,11 @@
     <w:unhideWhenUsed/>
     <w:qFormat/>
     <w:pPr>
-      <w:spacing w:before="100" w:after="100"/>
+      <w:spacing w:after="100" w:before="100"/>
       <w:ind w:firstLine="0" w:left="480" w:right="480"/>
     </w:pPr>
   </w:style>
-  <w:style w:type="paragraph" w:styleId="FootnoteText">
+  <w:style w:styleId="FootnoteText" w:type="paragraph">
     <w:name w:val="Footnote Text"/>
     <w:basedOn w:val="Normal"/>
     <w:next w:val="FootnoteText"/>
@@ -4478,28 +4536,48 @@
     <w:unhideWhenUsed/>
     <w:qFormat/>
   </w:style>
-  <w:style w:type="character" w:default="1" w:styleId="DefaultParagraphFont">
+  <w:style w:styleId="FootnoteBlockText" w:type="paragraph">
+    <w:name w:val="Footnote Block Text"/>
+    <w:basedOn w:val="FootnoteText"/>
+    <w:next w:val="FootnoteText"/>
+    <w:uiPriority w:val="9"/>
+    <w:unhideWhenUsed/>
+    <w:qFormat/>
+    <w:pPr>
+      <w:spacing w:after="100" w:before="100"/>
+      <w:ind w:firstLine="0" w:left="480" w:right="480"/>
+    </w:pPr>
+  </w:style>
+  <w:style w:default="1" w:styleId="DefaultParagraphFont" w:type="character">
     <w:name w:val="Default Paragraph Font"/>
     <w:semiHidden/>
     <w:unhideWhenUsed/>
   </w:style>
-  <w:style w:type="table" w:default="1" w:styleId="Table">
+  <w:style w:default="1" w:styleId="Table" w:type="table">
     <w:name w:val="Table"/>
     <w:basedOn w:val="TableNormal"/>
     <w:semiHidden/>
     <w:unhideWhenUsed/>
     <w:qFormat/>
     <w:tblPr>
-      <w:tblInd w:w="0" w:type="dxa"/>
+      <w:tblInd w:type="dxa" w:w="0"/>
       <w:tblCellMar>
-        <w:top w:w="0" w:type="dxa"/>
-        <w:left w:w="108" w:type="dxa"/>
-        <w:bottom w:w="0" w:type="dxa"/>
-        <w:right w:w="108" w:type="dxa"/>
+        <w:top w:type="dxa" w:w="0"/>
+        <w:left w:type="dxa" w:w="108"/>
+        <w:bottom w:type="dxa" w:w="0"/>
+        <w:right w:type="dxa" w:w="108"/>
       </w:tblCellMar>
     </w:tblPr>
-  </w:style>
-  <w:style w:type="paragraph" w:customStyle="1" w:styleId="DefinitionTerm">
+    <w:tblStylePr w:type="firstRow">
+      <w:tcPr>
+        <w:tcBorders>
+          <w:bottom w:val="single"/>
+        </w:tcBorders>
+        <w:vAlign w:val="bottom"/>
+      </w:tcPr>
+    </w:tblStylePr>
+  </w:style>
+  <w:style w:customStyle="1" w:styleId="DefinitionTerm" w:type="paragraph">
     <w:name w:val="Definition Term"/>
     <w:basedOn w:val="Normal"/>
     <w:next w:val="Definition"/>
@@ -4512,49 +4590,49 @@
       <w:b/>
     </w:rPr>
   </w:style>
-  <w:style w:type="paragraph" w:customStyle="1" w:styleId="Definition">
+  <w:style w:customStyle="1" w:styleId="Definition" w:type="paragraph">
     <w:name w:val="Definition"/>
     <w:basedOn w:val="Normal"/>
   </w:style>
-  <w:style w:type="paragraph" w:styleId="Caption">
+  <w:style w:styleId="Caption" w:type="paragraph">
     <w:name w:val="Caption"/>
     <w:basedOn w:val="Normal"/>
     <w:link w:val="BodyTextChar"/>
     <w:pPr>
-      <w:spacing w:before="0" w:after="120"/>
+      <w:spacing w:after="120" w:before="0"/>
     </w:pPr>
     <w:rPr>
       <w:i/>
     </w:rPr>
   </w:style>
-  <w:style w:type="paragraph" w:customStyle="1" w:styleId="TableCaption">
+  <w:style w:customStyle="1" w:styleId="TableCaption" w:type="paragraph">
     <w:name w:val="Table Caption"/>
     <w:basedOn w:val="Caption"/>
     <w:pPr>
       <w:keepNext/>
     </w:pPr>
   </w:style>
-  <w:style w:type="paragraph" w:customStyle="1" w:styleId="ImageCaption">
+  <w:style w:customStyle="1" w:styleId="ImageCaption" w:type="paragraph">
     <w:name w:val="Image Caption"/>
     <w:basedOn w:val="Caption"/>
   </w:style>
-  <w:style w:type="paragraph" w:customStyle="1" w:styleId="Figure">
+  <w:style w:customStyle="1" w:styleId="Figure" w:type="paragraph">
     <w:name w:val="Figure"/>
     <w:basedOn w:val="Normal"/>
   </w:style>
-  <w:style w:type="paragraph" w:customStyle="1" w:styleId="CaptionedFigure">
+  <w:style w:customStyle="1" w:styleId="CaptionedFigure" w:type="paragraph">
     <w:name w:val="Captioned Figure"/>
     <w:basedOn w:val="Figure"/>
     <w:pPr>
       <w:keepNext/>
     </w:pPr>
   </w:style>
-  <w:style w:type="character" w:customStyle="1" w:styleId="BodyTextChar">
+  <w:style w:customStyle="1" w:styleId="BodyTextChar" w:type="character">
     <w:name w:val="Body Text Char"/>
     <w:basedOn w:val="DefaultParagraphFont"/>
     <w:link w:val="BodyText"/>
   </w:style>
-  <w:style w:type="character" w:customStyle="1" w:styleId="VerbatimChar">
+  <w:style w:customStyle="1" w:styleId="VerbatimChar" w:type="character">
     <w:name w:val="Verbatim Char"/>
     <w:basedOn w:val="BodyTextChar"/>
     <w:rPr>
@@ -4562,25 +4640,25 @@
       <w:sz w:val="22"/>
     </w:rPr>
   </w:style>
-  <w:style w:type="character" w:customStyle="1" w:styleId="SectionNumber">
+  <w:style w:customStyle="1" w:styleId="SectionNumber" w:type="character">
     <w:name w:val="Section Number"/>
     <w:basedOn w:val="BodyTextChar"/>
   </w:style>
-  <w:style w:type="character" w:styleId="FootnoteReference">
+  <w:style w:styleId="FootnoteReference" w:type="character">
     <w:name w:val="Footnote Reference"/>
     <w:basedOn w:val="BodyTextChar"/>
     <w:rPr>
       <w:vertAlign w:val="superscript"/>
     </w:rPr>
   </w:style>
-  <w:style w:type="character" w:styleId="Hyperlink">
+  <w:style w:styleId="Hyperlink" w:type="character">
     <w:name w:val="Hyperlink"/>
     <w:basedOn w:val="BodyTextChar"/>
     <w:rPr>
-      <w:color w:val="4F81BD" w:themeColor="accent1"/>
-    </w:rPr>
-  </w:style>
-  <w:style w:type="paragraph" w:styleId="TOCHeading">
+      <w:color w:themeColor="accent1" w:val="4F81BD"/>
+    </w:rPr>
+  </w:style>
+  <w:style w:styleId="TOCHeading" w:type="paragraph">
     <w:name w:val="TOC Heading"/>
     <w:basedOn w:val="Heading1"/>
     <w:next w:val="BodyText"/>
@@ -4592,10 +4670,10 @@
       <w:outlineLvl w:val="9"/>
     </w:pPr>
     <w:rPr>
-      <w:rFonts w:asciiTheme="majorHAnsi" w:eastAsiaTheme="majorEastAsia" w:hAnsiTheme="majorHAnsi" w:cstheme="majorBidi"/>
+      <w:rFonts w:asciiTheme="majorHAnsi" w:cstheme="majorBidi" w:eastAsiaTheme="majorEastAsia" w:hAnsiTheme="majorHAnsi"/>
       <w:b w:val="0"/>
       <w:bCs w:val="0"/>
-      <w:color w:val="365F91" w:themeColor="accent1" w:themeShade="BF"/>
+      <w:color w:themeColor="accent1" w:themeShade="BF" w:val="365F91"/>
     </w:rPr>
   </w:style>
   <w:style w:type="paragraph" w:customStyle="1" w:styleId="SourceCode">
@@ -4610,8 +4688,8 @@
     <w:name w:val="KeywordTok"/>
     <w:basedOn w:val="VerbatimChar"/>
     <w:rPr>
+      <w:b/>
       <w:color w:val="007020"/>
-      <w:b/>
     </w:rPr>
   </w:style>
   <w:style w:type="character" w:customStyle="1" w:styleId="DataTypeTok">
@@ -4687,40 +4765,43 @@
   <w:style w:type="character" w:customStyle="1" w:styleId="ImportTok">
     <w:name w:val="ImportTok"/>
     <w:basedOn w:val="VerbatimChar"/>
-    <w:rPr/>
+    <w:rPr>
+      <w:b/>
+      <w:color w:val="008000"/>
+    </w:rPr>
   </w:style>
   <w:style w:type="character" w:customStyle="1" w:styleId="CommentTok">
     <w:name w:val="CommentTok"/>
     <w:basedOn w:val="VerbatimChar"/>
     <w:rPr>
+      <w:i/>
       <w:color w:val="60a0b0"/>
-      <w:i/>
     </w:rPr>
   </w:style>
   <w:style w:type="character" w:customStyle="1" w:styleId="DocumentationTok">
     <w:name w:val="DocumentationTok"/>
     <w:basedOn w:val="VerbatimChar"/>
     <w:rPr>
+      <w:i/>
       <w:color w:val="ba2121"/>
-      <w:i/>
     </w:rPr>
   </w:style>
   <w:style w:type="character" w:customStyle="1" w:styleId="AnnotationTok">
     <w:name w:val="AnnotationTok"/>
     <w:basedOn w:val="VerbatimChar"/>
     <w:rPr>
-      <w:color w:val="60a0b0"/>
       <w:b/>
       <w:i/>
+      <w:color w:val="60a0b0"/>
     </w:rPr>
   </w:style>
   <w:style w:type="character" w:customStyle="1" w:styleId="CommentVarTok">
     <w:name w:val="CommentVarTok"/>
     <w:basedOn w:val="VerbatimChar"/>
     <w:rPr>
-      <w:color w:val="60a0b0"/>
       <w:b/>
       <w:i/>
+      <w:color w:val="60a0b0"/>
     </w:rPr>
   </w:style>
   <w:style w:type="character" w:customStyle="1" w:styleId="OtherTok">
@@ -4748,8 +4829,8 @@
     <w:name w:val="ControlFlowTok"/>
     <w:basedOn w:val="VerbatimChar"/>
     <w:rPr>
+      <w:b/>
       <w:color w:val="007020"/>
-      <w:b/>
     </w:rPr>
   </w:style>
   <w:style w:type="character" w:customStyle="1" w:styleId="OperatorTok">
@@ -4762,7 +4843,9 @@
   <w:style w:type="character" w:customStyle="1" w:styleId="BuiltInTok">
     <w:name w:val="BuiltInTok"/>
     <w:basedOn w:val="VerbatimChar"/>
-    <w:rPr/>
+    <w:rPr>
+      <w:color w:val="008000"/>
+    </w:rPr>
   </w:style>
   <w:style w:type="character" w:customStyle="1" w:styleId="ExtensionTok">
     <w:name w:val="ExtensionTok"/>
@@ -4792,34 +4875,34 @@
     <w:name w:val="InformationTok"/>
     <w:basedOn w:val="VerbatimChar"/>
     <w:rPr>
-      <w:color w:val="60a0b0"/>
       <w:b/>
       <w:i/>
+      <w:color w:val="60a0b0"/>
     </w:rPr>
   </w:style>
   <w:style w:type="character" w:customStyle="1" w:styleId="WarningTok">
     <w:name w:val="WarningTok"/>
     <w:basedOn w:val="VerbatimChar"/>
     <w:rPr>
-      <w:color w:val="60a0b0"/>
       <w:b/>
       <w:i/>
+      <w:color w:val="60a0b0"/>
     </w:rPr>
   </w:style>
   <w:style w:type="character" w:customStyle="1" w:styleId="AlertTok">
     <w:name w:val="AlertTok"/>
     <w:basedOn w:val="VerbatimChar"/>
     <w:rPr>
+      <w:b/>
       <w:color w:val="ff0000"/>
-      <w:b/>
     </w:rPr>
   </w:style>
   <w:style w:type="character" w:customStyle="1" w:styleId="ErrorTok">
     <w:name w:val="ErrorTok"/>
     <w:basedOn w:val="VerbatimChar"/>
     <w:rPr>
+      <w:b/>
       <w:color w:val="ff0000"/>
-      <w:b/>
     </w:rPr>
   </w:style>
   <w:style w:type="character" w:customStyle="1" w:styleId="NormalTok">
@@ -4841,44 +4924,44 @@
         <a:sysClr val="window" lastClr="FFFFFF"/>
       </a:lt1>
       <a:dk2>
-        <a:srgbClr val="1F497D"/>
+        <a:srgbClr val="0E2841"/>
       </a:dk2>
       <a:lt2>
-        <a:srgbClr val="EEECE1"/>
+        <a:srgbClr val="E8E8E8"/>
       </a:lt2>
       <a:accent1>
-        <a:srgbClr val="4F81BD"/>
+        <a:srgbClr val="156082"/>
       </a:accent1>
       <a:accent2>
-        <a:srgbClr val="C0504D"/>
+        <a:srgbClr val="E97132"/>
       </a:accent2>
       <a:accent3>
-        <a:srgbClr val="9BBB59"/>
+        <a:srgbClr val="196B24"/>
       </a:accent3>
       <a:accent4>
-        <a:srgbClr val="8064A2"/>
+        <a:srgbClr val="0F9ED5"/>
       </a:accent4>
       <a:accent5>
-        <a:srgbClr val="4BACC6"/>
+        <a:srgbClr val="A02B93"/>
       </a:accent5>
       <a:accent6>
-        <a:srgbClr val="F79646"/>
+        <a:srgbClr val="4EA72E"/>
       </a:accent6>
       <a:hlink>
-        <a:srgbClr val="0000FF"/>
+        <a:srgbClr val="467886"/>
       </a:hlink>
       <a:folHlink>
-        <a:srgbClr val="800080"/>
+        <a:srgbClr val="96607D"/>
       </a:folHlink>
     </a:clrScheme>
     <a:fontScheme name="Office">
       <a:majorFont>
-        <a:latin typeface="Calibri"/>
+        <a:latin typeface="Aptos Display" panose="02110004020202020204"/>
         <a:ea typeface=""/>
         <a:cs typeface=""/>
-        <a:font script="Jpan" typeface="ＭＳ ゴシック"/>
+        <a:font script="Jpan" typeface="游ゴシック Light"/>
         <a:font script="Hang" typeface="맑은 고딕"/>
-        <a:font script="Hans" typeface="宋体"/>
+        <a:font script="Hans" typeface="等线 Light"/>
         <a:font script="Hant" typeface="新細明體"/>
         <a:font script="Arab" typeface="Times New Roman"/>
         <a:font script="Hebr" typeface="Times New Roman"/>
@@ -4905,14 +4988,32 @@
         <a:font script="Mong" typeface="Mongolian Baiti"/>
         <a:font script="Viet" typeface="Times New Roman"/>
         <a:font script="Uigh" typeface="Microsoft Uighur"/>
+        <a:font script="Geor" typeface="Sylfaen"/>
+        <a:font script="Armn" typeface="Arial"/>
+        <a:font script="Bugi" typeface="Leelawadee UI"/>
+        <a:font script="Bopo" typeface="Microsoft JhengHei"/>
+        <a:font script="Java" typeface="Javanese Text"/>
+        <a:font script="Lisu" typeface="Segoe UI"/>
+        <a:font script="Mymr" typeface="Myanmar Text"/>
+        <a:font script="Nkoo" typeface="Ebrima"/>
+        <a:font script="Olck" typeface="Nirmala UI"/>
+        <a:font script="Osma" typeface="Ebrima"/>
+        <a:font script="Phag" typeface="Phagspa"/>
+        <a:font script="Syrn" typeface="Estrangelo Edessa"/>
+        <a:font script="Syrj" typeface="Estrangelo Edessa"/>
+        <a:font script="Syre" typeface="Estrangelo Edessa"/>
+        <a:font script="Sora" typeface="Nirmala UI"/>
+        <a:font script="Tale" typeface="Microsoft Tai Le"/>
+        <a:font script="Talu" typeface="Microsoft New Tai Lue"/>
+        <a:font script="Tfng" typeface="Ebrima"/>
       </a:majorFont>
       <a:minorFont>
-        <a:latin typeface="Cambria"/>
+        <a:latin typeface="Aptos" panose="02110004020202020204"/>
         <a:ea typeface=""/>
         <a:cs typeface=""/>
-        <a:font script="Jpan" typeface="ＭＳ 明朝"/>
+        <a:font script="Jpan" typeface="游明朝"/>
         <a:font script="Hang" typeface="맑은 고딕"/>
-        <a:font script="Hans" typeface="宋体"/>
+        <a:font script="Hans" typeface="等线"/>
         <a:font script="Hant" typeface="新細明體"/>
         <a:font script="Arab" typeface="Arial"/>
         <a:font script="Hebr" typeface="Arial"/>
@@ -4939,6 +5040,24 @@
         <a:font script="Mong" typeface="Mongolian Baiti"/>
         <a:font script="Viet" typeface="Arial"/>
         <a:font script="Uigh" typeface="Microsoft Uighur"/>
+        <a:font script="Geor" typeface="Sylfaen"/>
+        <a:font script="Armn" typeface="Arial"/>
+        <a:font script="Bugi" typeface="Leelawadee UI"/>
+        <a:font script="Bopo" typeface="Microsoft JhengHei"/>
+        <a:font script="Java" typeface="Javanese Text"/>
+        <a:font script="Lisu" typeface="Segoe UI"/>
+        <a:font script="Mymr" typeface="Myanmar Text"/>
+        <a:font script="Nkoo" typeface="Ebrima"/>
+        <a:font script="Olck" typeface="Nirmala UI"/>
+        <a:font script="Osma" typeface="Ebrima"/>
+        <a:font script="Phag" typeface="Phagspa"/>
+        <a:font script="Syrn" typeface="Estrangelo Edessa"/>
+        <a:font script="Syrj" typeface="Estrangelo Edessa"/>
+        <a:font script="Syre" typeface="Estrangelo Edessa"/>
+        <a:font script="Sora" typeface="Nirmala UI"/>
+        <a:font script="Tale" typeface="Microsoft Tai Le"/>
+        <a:font script="Talu" typeface="Microsoft New Tai Lue"/>
+        <a:font script="Tfng" typeface="Ebrima"/>
       </a:minorFont>
     </a:fontScheme>
     <a:fmtScheme name="Office">
@@ -4950,200 +5069,141 @@
           <a:gsLst>
             <a:gs pos="0">
               <a:schemeClr val="phClr">
-                <a:tint val="50000"/>
-                <a:satMod val="300000"/>
+                <a:lumMod val="110000"/>
+                <a:satMod val="105000"/>
+                <a:tint val="67000"/>
               </a:schemeClr>
             </a:gs>
-            <a:gs pos="35000">
+            <a:gs pos="50000">
               <a:schemeClr val="phClr">
-                <a:tint val="37000"/>
-                <a:satMod val="300000"/>
+                <a:lumMod val="105000"/>
+                <a:satMod val="103000"/>
+                <a:tint val="73000"/>
               </a:schemeClr>
             </a:gs>
             <a:gs pos="100000">
               <a:schemeClr val="phClr">
-                <a:tint val="15000"/>
-                <a:satMod val="350000"/>
+                <a:lumMod val="105000"/>
+                <a:satMod val="109000"/>
+                <a:tint val="81000"/>
               </a:schemeClr>
             </a:gs>
           </a:gsLst>
-          <a:lin ang="16200000" scaled="1"/>
+          <a:lin ang="5400000" scaled="0"/>
         </a:gradFill>
         <a:gradFill rotWithShape="1">
           <a:gsLst>
             <a:gs pos="0">
               <a:schemeClr val="phClr">
-                <a:tint val="100000"/>
+                <a:satMod val="103000"/>
+                <a:lumMod val="102000"/>
+                <a:tint val="94000"/>
+              </a:schemeClr>
+            </a:gs>
+            <a:gs pos="50000">
+              <a:schemeClr val="phClr">
+                <a:satMod val="110000"/>
+                <a:lumMod val="100000"/>
                 <a:shade val="100000"/>
-                <a:satMod val="130000"/>
               </a:schemeClr>
             </a:gs>
             <a:gs pos="100000">
               <a:schemeClr val="phClr">
-                <a:tint val="50000"/>
-                <a:shade val="100000"/>
-                <a:satMod val="350000"/>
+                <a:lumMod val="99000"/>
+                <a:satMod val="120000"/>
+                <a:shade val="78000"/>
               </a:schemeClr>
             </a:gs>
           </a:gsLst>
-          <a:lin ang="16200000" scaled="0"/>
+          <a:lin ang="5400000" scaled="0"/>
         </a:gradFill>
       </a:fillStyleLst>
       <a:lnStyleLst>
-        <a:ln w="9525" cap="flat" cmpd="sng" algn="ctr">
-          <a:solidFill>
-            <a:schemeClr val="phClr">
-              <a:shade val="95000"/>
-              <a:satMod val="105000"/>
-            </a:schemeClr>
-          </a:solidFill>
-          <a:prstDash val="solid"/>
-        </a:ln>
-        <a:ln w="25400" cap="flat" cmpd="sng" algn="ctr">
+        <a:ln w="6350" cap="flat" cmpd="sng" algn="ctr">
           <a:solidFill>
             <a:schemeClr val="phClr"/>
           </a:solidFill>
           <a:prstDash val="solid"/>
+          <a:miter lim="800000"/>
         </a:ln>
-        <a:ln w="38100" cap="flat" cmpd="sng" algn="ctr">
+        <a:ln w="12700" cap="flat" cmpd="sng" algn="ctr">
           <a:solidFill>
             <a:schemeClr val="phClr"/>
           </a:solidFill>
           <a:prstDash val="solid"/>
+          <a:miter lim="800000"/>
+        </a:ln>
+        <a:ln w="19050" cap="flat" cmpd="sng" algn="ctr">
+          <a:solidFill>
+            <a:schemeClr val="phClr"/>
+          </a:solidFill>
+          <a:prstDash val="solid"/>
+          <a:miter lim="800000"/>
         </a:ln>
       </a:lnStyleLst>
       <a:effectStyleLst>
         <a:effectStyle>
+          <a:effectLst/>
+        </a:effectStyle>
+        <a:effectStyle>
+          <a:effectLst/>
+        </a:effectStyle>
+        <a:effectStyle>
           <a:effectLst>
-            <a:outerShdw blurRad="40000" dist="20000" dir="5400000" rotWithShape="0">
+            <a:outerShdw blurRad="57150" dist="19050" dir="5400000" algn="ctr" rotWithShape="0">
               <a:srgbClr val="000000">
-                <a:alpha val="38000"/>
+                <a:alpha val="63000"/>
               </a:srgbClr>
             </a:outerShdw>
           </a:effectLst>
-        </a:effectStyle>
-        <a:effectStyle>
-          <a:effectLst>
-            <a:outerShdw blurRad="40000" dist="23000" dir="5400000" rotWithShape="0">
-              <a:srgbClr val="000000">
-                <a:alpha val="35000"/>
-              </a:srgbClr>
-            </a:outerShdw>
-          </a:effectLst>
-        </a:effectStyle>
-        <a:effectStyle>
-          <a:effectLst>
-            <a:outerShdw blurRad="40000" dist="23000" dir="5400000" rotWithShape="0">
-              <a:srgbClr val="000000">
-                <a:alpha val="35000"/>
-              </a:srgbClr>
-            </a:outerShdw>
-          </a:effectLst>
-          <a:scene3d>
-            <a:camera prst="orthographicFront">
-              <a:rot lat="0" lon="0" rev="0"/>
-            </a:camera>
-            <a:lightRig rig="threePt" dir="t">
-              <a:rot lat="0" lon="0" rev="1200000"/>
-            </a:lightRig>
-          </a:scene3d>
-          <a:sp3d>
-            <a:bevelT w="63500" h="25400"/>
-          </a:sp3d>
         </a:effectStyle>
       </a:effectStyleLst>
       <a:bgFillStyleLst>
         <a:solidFill>
           <a:schemeClr val="phClr"/>
         </a:solidFill>
+        <a:solidFill>
+          <a:schemeClr val="phClr">
+            <a:tint val="95000"/>
+            <a:satMod val="170000"/>
+          </a:schemeClr>
+        </a:solidFill>
         <a:gradFill rotWithShape="1">
           <a:gsLst>
             <a:gs pos="0">
               <a:schemeClr val="phClr">
-                <a:tint val="40000"/>
-                <a:satMod val="350000"/>
+                <a:tint val="93000"/>
+                <a:satMod val="150000"/>
+                <a:shade val="98000"/>
+                <a:lumMod val="102000"/>
               </a:schemeClr>
             </a:gs>
-            <a:gs pos="40000">
+            <a:gs pos="50000">
               <a:schemeClr val="phClr">
-                <a:tint val="45000"/>
-                <a:shade val="99000"/>
-                <a:satMod val="350000"/>
+                <a:tint val="98000"/>
+                <a:satMod val="130000"/>
+                <a:shade val="90000"/>
+                <a:lumMod val="103000"/>
               </a:schemeClr>
             </a:gs>
             <a:gs pos="100000">
               <a:schemeClr val="phClr">
-                <a:shade val="20000"/>
-                <a:satMod val="255000"/>
+                <a:shade val="63000"/>
+                <a:satMod val="120000"/>
               </a:schemeClr>
             </a:gs>
           </a:gsLst>
-          <a:path path="circle">
-            <a:fillToRect l="50000" t="-80000" r="50000" b="180000"/>
-          </a:path>
-        </a:gradFill>
-        <a:gradFill rotWithShape="1">
-          <a:gsLst>
-            <a:gs pos="0">
-              <a:schemeClr val="phClr">
-                <a:tint val="80000"/>
-                <a:satMod val="300000"/>
-              </a:schemeClr>
-            </a:gs>
-            <a:gs pos="100000">
-              <a:schemeClr val="phClr">
-                <a:shade val="30000"/>
-                <a:satMod val="200000"/>
-              </a:schemeClr>
-            </a:gs>
-          </a:gsLst>
-          <a:path path="circle">
-            <a:fillToRect l="50000" t="50000" r="50000" b="50000"/>
-          </a:path>
+          <a:lin ang="5400000" scaled="0"/>
         </a:gradFill>
       </a:bgFillStyleLst>
     </a:fmtScheme>
   </a:themeElements>
-  <a:objectDefaults>
-    <a:spDef>
-      <a:spPr/>
-      <a:bodyPr/>
-      <a:lstStyle/>
-      <a:style>
-        <a:lnRef idx="1">
-          <a:schemeClr val="accent1"/>
-        </a:lnRef>
-        <a:fillRef idx="3">
-          <a:schemeClr val="accent1"/>
-        </a:fillRef>
-        <a:effectRef idx="2">
-          <a:schemeClr val="accent1"/>
-        </a:effectRef>
-        <a:fontRef idx="minor">
-          <a:schemeClr val="lt1"/>
-        </a:fontRef>
-      </a:style>
-    </a:spDef>
-    <a:lnDef>
-      <a:spPr/>
-      <a:bodyPr/>
-      <a:lstStyle/>
-      <a:style>
-        <a:lnRef idx="2">
-          <a:schemeClr val="accent1"/>
-        </a:lnRef>
-        <a:fillRef idx="0">
-          <a:schemeClr val="accent1"/>
-        </a:fillRef>
-        <a:effectRef idx="1">
-          <a:schemeClr val="accent1"/>
-        </a:effectRef>
-        <a:fontRef idx="minor">
-          <a:schemeClr val="tx1"/>
-        </a:fontRef>
-      </a:style>
-    </a:lnDef>
-  </a:objectDefaults>
+  <a:objectDefaults/>
   <a:extraClrSchemeLst/>
+  <a:extLst>
+    <a:ext uri="{05A4C25C-085E-4340-85A3-A5531E510DB2}">
+      <thm15:themeFamily xmlns:thm15="http://schemas.microsoft.com/office/thememl/2012/main" name="Office Theme" id="{2E142A2C-CD16-42D6-873A-C26D2A0506FA}" vid="{1BDDFF52-6CD6-40A5-AB3C-68EB2F1E4D0A}"/>
+    </a:ext>
+  </a:extLst>
 </a:theme>
 </file>
</xml_diff>